<commit_message>
Start each episode on an odd page with its own page numbering for duplex printing
Co-Authored-By: Claude Sonnet 5.5 <noreply@anthropic.com>
Claude-Session: https://claude.ai/code/session_01RN2uxeLPLA2oTbvJedRhXo
</commit_message>
<xml_diff>
--- a/podcast/Luyen_nghe_YouTube_24_bai.docx
+++ b/podcast/Luyen_nghe_YouTube_24_bai.docx
@@ -3279,8 +3279,18 @@
     </w:tbl>
     <w:p>
       <w:pPr>
+        <w:sectPr>
+          <w:footerReference w:type="default" r:id="rId7"/>
+          <w:pgSz w:w="11906" w:h="16838" w:orient="portrait"/>
+          <w:pgMar w:top="1000" w:right="1417" w:bottom="900" w:left="1417" w:header="708" w:footer="708" w:gutter="0"/>
+          <w:pgNumType/>
+          <w:docGrid w:linePitch="360"/>
+        </w:sectPr>
+      </w:pPr>
+    </w:p>
+    <w:p>
+      <w:pPr>
         <w:pStyle w:val="Heading2"/>
-        <w:pageBreakBefore/>
         <w:spacing w:after="100" w:before="0"/>
       </w:pPr>
       <w:r>
@@ -3383,7 +3393,7 @@
               </w:rPr>
               <w:t xml:space="preserve">Nghe: </w:t>
             </w:r>
-            <w:hyperlink w:history="1" r:id="rIdiieso4jfzdomwptp7wyzy">
+            <w:hyperlink w:history="1" r:id="rIdltmimwbinuhpcs-22oedh">
               <w:r>
                 <w:rPr>
                   <w:rStyle w:val="Hyperlink"/>
@@ -3451,7 +3461,7 @@
                           </pic:cNvPicPr>
                         </pic:nvPicPr>
                         <pic:blipFill>
-                          <a:blip r:embed="rId8" cstate="none"/>
+                          <a:blip r:embed="rId32" cstate="none"/>
                           <a:srcRect/>
                           <a:stretch>
                             <a:fillRect/>
@@ -4837,8 +4847,19 @@
     </w:tbl>
     <w:p>
       <w:pPr>
+        <w:sectPr>
+          <w:footerReference w:type="default" r:id="rId8"/>
+          <w:type w:val="oddPage"/>
+          <w:pgSz w:w="11906" w:h="16838" w:orient="portrait"/>
+          <w:pgMar w:top="1000" w:right="1417" w:bottom="900" w:left="1417" w:header="708" w:footer="708" w:gutter="0"/>
+          <w:pgNumType w:start="1"/>
+          <w:docGrid w:linePitch="360"/>
+        </w:sectPr>
+      </w:pPr>
+    </w:p>
+    <w:p>
+      <w:pPr>
         <w:pStyle w:val="Heading2"/>
-        <w:pageBreakBefore/>
         <w:spacing w:after="100" w:before="0"/>
       </w:pPr>
       <w:r>
@@ -4941,7 +4962,7 @@
               </w:rPr>
               <w:t xml:space="preserve">Nghe: </w:t>
             </w:r>
-            <w:hyperlink w:history="1" r:id="rIdg6nxr2rafqafr4hepw-wg">
+            <w:hyperlink w:history="1" r:id="rIdwqsu3iriulqrqycc7wyu1">
               <w:r>
                 <w:rPr>
                   <w:rStyle w:val="Hyperlink"/>
@@ -5009,7 +5030,7 @@
                           </pic:cNvPicPr>
                         </pic:nvPicPr>
                         <pic:blipFill>
-                          <a:blip r:embed="rId9" cstate="none"/>
+                          <a:blip r:embed="rId33" cstate="none"/>
                           <a:srcRect/>
                           <a:stretch>
                             <a:fillRect/>
@@ -6395,8 +6416,19 @@
     </w:tbl>
     <w:p>
       <w:pPr>
+        <w:sectPr>
+          <w:footerReference w:type="default" r:id="rId9"/>
+          <w:type w:val="oddPage"/>
+          <w:pgSz w:w="11906" w:h="16838" w:orient="portrait"/>
+          <w:pgMar w:top="1000" w:right="1417" w:bottom="900" w:left="1417" w:header="708" w:footer="708" w:gutter="0"/>
+          <w:pgNumType w:start="1"/>
+          <w:docGrid w:linePitch="360"/>
+        </w:sectPr>
+      </w:pPr>
+    </w:p>
+    <w:p>
+      <w:pPr>
         <w:pStyle w:val="Heading2"/>
-        <w:pageBreakBefore/>
         <w:spacing w:after="100" w:before="0"/>
       </w:pPr>
       <w:r>
@@ -6499,7 +6531,7 @@
               </w:rPr>
               <w:t xml:space="preserve">Nghe: </w:t>
             </w:r>
-            <w:hyperlink w:history="1" r:id="rIdxsmrlh8kgnzpupm_zdykh">
+            <w:hyperlink w:history="1" r:id="rIdsqcnnimkbsrwfp-gjogoq">
               <w:r>
                 <w:rPr>
                   <w:rStyle w:val="Hyperlink"/>
@@ -6567,7 +6599,7 @@
                           </pic:cNvPicPr>
                         </pic:nvPicPr>
                         <pic:blipFill>
-                          <a:blip r:embed="rId10" cstate="none"/>
+                          <a:blip r:embed="rId34" cstate="none"/>
                           <a:srcRect/>
                           <a:stretch>
                             <a:fillRect/>
@@ -7953,8 +7985,19 @@
     </w:tbl>
     <w:p>
       <w:pPr>
+        <w:sectPr>
+          <w:footerReference w:type="default" r:id="rId10"/>
+          <w:type w:val="oddPage"/>
+          <w:pgSz w:w="11906" w:h="16838" w:orient="portrait"/>
+          <w:pgMar w:top="1000" w:right="1417" w:bottom="900" w:left="1417" w:header="708" w:footer="708" w:gutter="0"/>
+          <w:pgNumType w:start="1"/>
+          <w:docGrid w:linePitch="360"/>
+        </w:sectPr>
+      </w:pPr>
+    </w:p>
+    <w:p>
+      <w:pPr>
         <w:pStyle w:val="Heading2"/>
-        <w:pageBreakBefore/>
         <w:spacing w:after="100" w:before="0"/>
       </w:pPr>
       <w:r>
@@ -8057,7 +8100,7 @@
               </w:rPr>
               <w:t xml:space="preserve">Nghe: </w:t>
             </w:r>
-            <w:hyperlink w:history="1" r:id="rIdtflnhnn_x23fxlkxnp4yc">
+            <w:hyperlink w:history="1" r:id="rIdkw11pdvvc6zxznyz6mdjc">
               <w:r>
                 <w:rPr>
                   <w:rStyle w:val="Hyperlink"/>
@@ -8125,7 +8168,7 @@
                           </pic:cNvPicPr>
                         </pic:nvPicPr>
                         <pic:blipFill>
-                          <a:blip r:embed="rId11" cstate="none"/>
+                          <a:blip r:embed="rId35" cstate="none"/>
                           <a:srcRect/>
                           <a:stretch>
                             <a:fillRect/>
@@ -9511,8 +9554,19 @@
     </w:tbl>
     <w:p>
       <w:pPr>
+        <w:sectPr>
+          <w:footerReference w:type="default" r:id="rId11"/>
+          <w:type w:val="oddPage"/>
+          <w:pgSz w:w="11906" w:h="16838" w:orient="portrait"/>
+          <w:pgMar w:top="1000" w:right="1417" w:bottom="900" w:left="1417" w:header="708" w:footer="708" w:gutter="0"/>
+          <w:pgNumType w:start="1"/>
+          <w:docGrid w:linePitch="360"/>
+        </w:sectPr>
+      </w:pPr>
+    </w:p>
+    <w:p>
+      <w:pPr>
         <w:pStyle w:val="Heading2"/>
-        <w:pageBreakBefore/>
         <w:spacing w:after="100" w:before="0"/>
       </w:pPr>
       <w:r>
@@ -9615,7 +9669,7 @@
               </w:rPr>
               <w:t xml:space="preserve">Nghe: </w:t>
             </w:r>
-            <w:hyperlink w:history="1" r:id="rIduaqg8e5bl9medu57ngeop">
+            <w:hyperlink w:history="1" r:id="rIdklgw1fu5xz_kwu3xpcvei">
               <w:r>
                 <w:rPr>
                   <w:rStyle w:val="Hyperlink"/>
@@ -9683,7 +9737,7 @@
                           </pic:cNvPicPr>
                         </pic:nvPicPr>
                         <pic:blipFill>
-                          <a:blip r:embed="rId12" cstate="none"/>
+                          <a:blip r:embed="rId36" cstate="none"/>
                           <a:srcRect/>
                           <a:stretch>
                             <a:fillRect/>
@@ -11069,8 +11123,19 @@
     </w:tbl>
     <w:p>
       <w:pPr>
+        <w:sectPr>
+          <w:footerReference w:type="default" r:id="rId12"/>
+          <w:type w:val="oddPage"/>
+          <w:pgSz w:w="11906" w:h="16838" w:orient="portrait"/>
+          <w:pgMar w:top="1000" w:right="1417" w:bottom="900" w:left="1417" w:header="708" w:footer="708" w:gutter="0"/>
+          <w:pgNumType w:start="1"/>
+          <w:docGrid w:linePitch="360"/>
+        </w:sectPr>
+      </w:pPr>
+    </w:p>
+    <w:p>
+      <w:pPr>
         <w:pStyle w:val="Heading2"/>
-        <w:pageBreakBefore/>
         <w:spacing w:after="100" w:before="0"/>
       </w:pPr>
       <w:r>
@@ -11173,7 +11238,7 @@
               </w:rPr>
               <w:t xml:space="preserve">Nghe: </w:t>
             </w:r>
-            <w:hyperlink w:history="1" r:id="rIdvawklqwhr3jclcvuxua6j">
+            <w:hyperlink w:history="1" r:id="rIdwglaahcqvs8pw0jjgtc5j">
               <w:r>
                 <w:rPr>
                   <w:rStyle w:val="Hyperlink"/>
@@ -11241,7 +11306,7 @@
                           </pic:cNvPicPr>
                         </pic:nvPicPr>
                         <pic:blipFill>
-                          <a:blip r:embed="rId13" cstate="none"/>
+                          <a:blip r:embed="rId37" cstate="none"/>
                           <a:srcRect/>
                           <a:stretch>
                             <a:fillRect/>
@@ -12627,8 +12692,19 @@
     </w:tbl>
     <w:p>
       <w:pPr>
+        <w:sectPr>
+          <w:footerReference w:type="default" r:id="rId13"/>
+          <w:type w:val="oddPage"/>
+          <w:pgSz w:w="11906" w:h="16838" w:orient="portrait"/>
+          <w:pgMar w:top="1000" w:right="1417" w:bottom="900" w:left="1417" w:header="708" w:footer="708" w:gutter="0"/>
+          <w:pgNumType w:start="1"/>
+          <w:docGrid w:linePitch="360"/>
+        </w:sectPr>
+      </w:pPr>
+    </w:p>
+    <w:p>
+      <w:pPr>
         <w:pStyle w:val="Heading2"/>
-        <w:pageBreakBefore/>
         <w:spacing w:after="100" w:before="0"/>
       </w:pPr>
       <w:r>
@@ -12731,7 +12807,7 @@
               </w:rPr>
               <w:t xml:space="preserve">Nghe: </w:t>
             </w:r>
-            <w:hyperlink w:history="1" r:id="rIdhsw0ewfs9g3pmo1ddy3yl">
+            <w:hyperlink w:history="1" r:id="rIdm7kjkijvwxsdxf_rkx5go">
               <w:r>
                 <w:rPr>
                   <w:rStyle w:val="Hyperlink"/>
@@ -12799,7 +12875,7 @@
                           </pic:cNvPicPr>
                         </pic:nvPicPr>
                         <pic:blipFill>
-                          <a:blip r:embed="rId14" cstate="none"/>
+                          <a:blip r:embed="rId38" cstate="none"/>
                           <a:srcRect/>
                           <a:stretch>
                             <a:fillRect/>
@@ -14185,8 +14261,19 @@
     </w:tbl>
     <w:p>
       <w:pPr>
+        <w:sectPr>
+          <w:footerReference w:type="default" r:id="rId14"/>
+          <w:type w:val="oddPage"/>
+          <w:pgSz w:w="11906" w:h="16838" w:orient="portrait"/>
+          <w:pgMar w:top="1000" w:right="1417" w:bottom="900" w:left="1417" w:header="708" w:footer="708" w:gutter="0"/>
+          <w:pgNumType w:start="1"/>
+          <w:docGrid w:linePitch="360"/>
+        </w:sectPr>
+      </w:pPr>
+    </w:p>
+    <w:p>
+      <w:pPr>
         <w:pStyle w:val="Heading2"/>
-        <w:pageBreakBefore/>
         <w:spacing w:after="100" w:before="0"/>
       </w:pPr>
       <w:r>
@@ -14289,7 +14376,7 @@
               </w:rPr>
               <w:t xml:space="preserve">Nghe: </w:t>
             </w:r>
-            <w:hyperlink w:history="1" r:id="rId8nseykjmff0ixwj35z71w">
+            <w:hyperlink w:history="1" r:id="rIdl9vccewr-y48j3tmzef1u">
               <w:r>
                 <w:rPr>
                   <w:rStyle w:val="Hyperlink"/>
@@ -14357,7 +14444,7 @@
                           </pic:cNvPicPr>
                         </pic:nvPicPr>
                         <pic:blipFill>
-                          <a:blip r:embed="rId15" cstate="none"/>
+                          <a:blip r:embed="rId39" cstate="none"/>
                           <a:srcRect/>
                           <a:stretch>
                             <a:fillRect/>
@@ -15743,8 +15830,19 @@
     </w:tbl>
     <w:p>
       <w:pPr>
+        <w:sectPr>
+          <w:footerReference w:type="default" r:id="rId15"/>
+          <w:type w:val="oddPage"/>
+          <w:pgSz w:w="11906" w:h="16838" w:orient="portrait"/>
+          <w:pgMar w:top="1000" w:right="1417" w:bottom="900" w:left="1417" w:header="708" w:footer="708" w:gutter="0"/>
+          <w:pgNumType w:start="1"/>
+          <w:docGrid w:linePitch="360"/>
+        </w:sectPr>
+      </w:pPr>
+    </w:p>
+    <w:p>
+      <w:pPr>
         <w:pStyle w:val="Heading2"/>
-        <w:pageBreakBefore/>
         <w:spacing w:after="100" w:before="0"/>
       </w:pPr>
       <w:r>
@@ -15847,7 +15945,7 @@
               </w:rPr>
               <w:t xml:space="preserve">Nghe: </w:t>
             </w:r>
-            <w:hyperlink w:history="1" r:id="rIdsktwmfnu-tfm7prkpkgzy">
+            <w:hyperlink w:history="1" r:id="rIdnjfo6h6fpwnjimqozxyua">
               <w:r>
                 <w:rPr>
                   <w:rStyle w:val="Hyperlink"/>
@@ -15915,7 +16013,7 @@
                           </pic:cNvPicPr>
                         </pic:nvPicPr>
                         <pic:blipFill>
-                          <a:blip r:embed="rId16" cstate="none"/>
+                          <a:blip r:embed="rId40" cstate="none"/>
                           <a:srcRect/>
                           <a:stretch>
                             <a:fillRect/>
@@ -17301,8 +17399,19 @@
     </w:tbl>
     <w:p>
       <w:pPr>
+        <w:sectPr>
+          <w:footerReference w:type="default" r:id="rId16"/>
+          <w:type w:val="oddPage"/>
+          <w:pgSz w:w="11906" w:h="16838" w:orient="portrait"/>
+          <w:pgMar w:top="1000" w:right="1417" w:bottom="900" w:left="1417" w:header="708" w:footer="708" w:gutter="0"/>
+          <w:pgNumType w:start="1"/>
+          <w:docGrid w:linePitch="360"/>
+        </w:sectPr>
+      </w:pPr>
+    </w:p>
+    <w:p>
+      <w:pPr>
         <w:pStyle w:val="Heading2"/>
-        <w:pageBreakBefore/>
         <w:spacing w:after="100" w:before="0"/>
       </w:pPr>
       <w:r>
@@ -17405,7 +17514,7 @@
               </w:rPr>
               <w:t xml:space="preserve">Nghe: </w:t>
             </w:r>
-            <w:hyperlink w:history="1" r:id="rIdgvmvsaadzqlxjvtdmhd5i">
+            <w:hyperlink w:history="1" r:id="rIdchmcykn2kuidkwv67vwog">
               <w:r>
                 <w:rPr>
                   <w:rStyle w:val="Hyperlink"/>
@@ -17473,7 +17582,7 @@
                           </pic:cNvPicPr>
                         </pic:nvPicPr>
                         <pic:blipFill>
-                          <a:blip r:embed="rId17" cstate="none"/>
+                          <a:blip r:embed="rId41" cstate="none"/>
                           <a:srcRect/>
                           <a:stretch>
                             <a:fillRect/>
@@ -18859,8 +18968,19 @@
     </w:tbl>
     <w:p>
       <w:pPr>
+        <w:sectPr>
+          <w:footerReference w:type="default" r:id="rId17"/>
+          <w:type w:val="oddPage"/>
+          <w:pgSz w:w="11906" w:h="16838" w:orient="portrait"/>
+          <w:pgMar w:top="1000" w:right="1417" w:bottom="900" w:left="1417" w:header="708" w:footer="708" w:gutter="0"/>
+          <w:pgNumType w:start="1"/>
+          <w:docGrid w:linePitch="360"/>
+        </w:sectPr>
+      </w:pPr>
+    </w:p>
+    <w:p>
+      <w:pPr>
         <w:pStyle w:val="Heading2"/>
-        <w:pageBreakBefore/>
         <w:spacing w:after="100" w:before="0"/>
       </w:pPr>
       <w:r>
@@ -18963,7 +19083,7 @@
               </w:rPr>
               <w:t xml:space="preserve">Nghe: </w:t>
             </w:r>
-            <w:hyperlink w:history="1" r:id="rIdw3k8p_5l2u3jjj2ffvr2l">
+            <w:hyperlink w:history="1" r:id="rIdefxwnpga0yoj4xmal5pel">
               <w:r>
                 <w:rPr>
                   <w:rStyle w:val="Hyperlink"/>
@@ -19031,7 +19151,7 @@
                           </pic:cNvPicPr>
                         </pic:nvPicPr>
                         <pic:blipFill>
-                          <a:blip r:embed="rId18" cstate="none"/>
+                          <a:blip r:embed="rId42" cstate="none"/>
                           <a:srcRect/>
                           <a:stretch>
                             <a:fillRect/>
@@ -20417,8 +20537,19 @@
     </w:tbl>
     <w:p>
       <w:pPr>
+        <w:sectPr>
+          <w:footerReference w:type="default" r:id="rId18"/>
+          <w:type w:val="oddPage"/>
+          <w:pgSz w:w="11906" w:h="16838" w:orient="portrait"/>
+          <w:pgMar w:top="1000" w:right="1417" w:bottom="900" w:left="1417" w:header="708" w:footer="708" w:gutter="0"/>
+          <w:pgNumType w:start="1"/>
+          <w:docGrid w:linePitch="360"/>
+        </w:sectPr>
+      </w:pPr>
+    </w:p>
+    <w:p>
+      <w:pPr>
         <w:pStyle w:val="Heading2"/>
-        <w:pageBreakBefore/>
         <w:spacing w:after="100" w:before="0"/>
       </w:pPr>
       <w:r>
@@ -20521,7 +20652,7 @@
               </w:rPr>
               <w:t xml:space="preserve">Nghe: </w:t>
             </w:r>
-            <w:hyperlink w:history="1" r:id="rIdlqyf_bsclujz7alfdhbqj">
+            <w:hyperlink w:history="1" r:id="rIdvbt6wde3vw3luopjmkvdj">
               <w:r>
                 <w:rPr>
                   <w:rStyle w:val="Hyperlink"/>
@@ -20589,7 +20720,7 @@
                           </pic:cNvPicPr>
                         </pic:nvPicPr>
                         <pic:blipFill>
-                          <a:blip r:embed="rId19" cstate="none"/>
+                          <a:blip r:embed="rId43" cstate="none"/>
                           <a:srcRect/>
                           <a:stretch>
                             <a:fillRect/>
@@ -21975,8 +22106,19 @@
     </w:tbl>
     <w:p>
       <w:pPr>
+        <w:sectPr>
+          <w:footerReference w:type="default" r:id="rId19"/>
+          <w:type w:val="oddPage"/>
+          <w:pgSz w:w="11906" w:h="16838" w:orient="portrait"/>
+          <w:pgMar w:top="1000" w:right="1417" w:bottom="900" w:left="1417" w:header="708" w:footer="708" w:gutter="0"/>
+          <w:pgNumType w:start="1"/>
+          <w:docGrid w:linePitch="360"/>
+        </w:sectPr>
+      </w:pPr>
+    </w:p>
+    <w:p>
+      <w:pPr>
         <w:pStyle w:val="Heading2"/>
-        <w:pageBreakBefore/>
         <w:spacing w:after="100" w:before="0"/>
       </w:pPr>
       <w:r>
@@ -22079,7 +22221,7 @@
               </w:rPr>
               <w:t xml:space="preserve">Nghe: </w:t>
             </w:r>
-            <w:hyperlink w:history="1" r:id="rIdhh54pm4y4twzfdhmu13cz">
+            <w:hyperlink w:history="1" r:id="rIdlps8m2oz-z3d8zg6mt_zf">
               <w:r>
                 <w:rPr>
                   <w:rStyle w:val="Hyperlink"/>
@@ -22147,7 +22289,7 @@
                           </pic:cNvPicPr>
                         </pic:nvPicPr>
                         <pic:blipFill>
-                          <a:blip r:embed="rId20" cstate="none"/>
+                          <a:blip r:embed="rId44" cstate="none"/>
                           <a:srcRect/>
                           <a:stretch>
                             <a:fillRect/>
@@ -23533,8 +23675,19 @@
     </w:tbl>
     <w:p>
       <w:pPr>
+        <w:sectPr>
+          <w:footerReference w:type="default" r:id="rId20"/>
+          <w:type w:val="oddPage"/>
+          <w:pgSz w:w="11906" w:h="16838" w:orient="portrait"/>
+          <w:pgMar w:top="1000" w:right="1417" w:bottom="900" w:left="1417" w:header="708" w:footer="708" w:gutter="0"/>
+          <w:pgNumType w:start="1"/>
+          <w:docGrid w:linePitch="360"/>
+        </w:sectPr>
+      </w:pPr>
+    </w:p>
+    <w:p>
+      <w:pPr>
         <w:pStyle w:val="Heading2"/>
-        <w:pageBreakBefore/>
         <w:spacing w:after="100" w:before="0"/>
       </w:pPr>
       <w:r>
@@ -23637,7 +23790,7 @@
               </w:rPr>
               <w:t xml:space="preserve">Nghe: </w:t>
             </w:r>
-            <w:hyperlink w:history="1" r:id="rId7rqnkod9synnqoohrxvu2">
+            <w:hyperlink w:history="1" r:id="rIdxxjm_dwxfwultvbodwjkj">
               <w:r>
                 <w:rPr>
                   <w:rStyle w:val="Hyperlink"/>
@@ -23705,7 +23858,7 @@
                           </pic:cNvPicPr>
                         </pic:nvPicPr>
                         <pic:blipFill>
-                          <a:blip r:embed="rId21" cstate="none"/>
+                          <a:blip r:embed="rId45" cstate="none"/>
                           <a:srcRect/>
                           <a:stretch>
                             <a:fillRect/>
@@ -25091,8 +25244,19 @@
     </w:tbl>
     <w:p>
       <w:pPr>
+        <w:sectPr>
+          <w:footerReference w:type="default" r:id="rId21"/>
+          <w:type w:val="oddPage"/>
+          <w:pgSz w:w="11906" w:h="16838" w:orient="portrait"/>
+          <w:pgMar w:top="1000" w:right="1417" w:bottom="900" w:left="1417" w:header="708" w:footer="708" w:gutter="0"/>
+          <w:pgNumType w:start="1"/>
+          <w:docGrid w:linePitch="360"/>
+        </w:sectPr>
+      </w:pPr>
+    </w:p>
+    <w:p>
+      <w:pPr>
         <w:pStyle w:val="Heading2"/>
-        <w:pageBreakBefore/>
         <w:spacing w:after="100" w:before="0"/>
       </w:pPr>
       <w:r>
@@ -25195,7 +25359,7 @@
               </w:rPr>
               <w:t xml:space="preserve">Nghe: </w:t>
             </w:r>
-            <w:hyperlink w:history="1" r:id="rIdkrug9xotqgot5fbk5khoh">
+            <w:hyperlink w:history="1" r:id="rIddcjqk6k-me0u2flsiea9j">
               <w:r>
                 <w:rPr>
                   <w:rStyle w:val="Hyperlink"/>
@@ -25263,7 +25427,7 @@
                           </pic:cNvPicPr>
                         </pic:nvPicPr>
                         <pic:blipFill>
-                          <a:blip r:embed="rId22" cstate="none"/>
+                          <a:blip r:embed="rId46" cstate="none"/>
                           <a:srcRect/>
                           <a:stretch>
                             <a:fillRect/>
@@ -26649,8 +26813,19 @@
     </w:tbl>
     <w:p>
       <w:pPr>
+        <w:sectPr>
+          <w:footerReference w:type="default" r:id="rId22"/>
+          <w:type w:val="oddPage"/>
+          <w:pgSz w:w="11906" w:h="16838" w:orient="portrait"/>
+          <w:pgMar w:top="1000" w:right="1417" w:bottom="900" w:left="1417" w:header="708" w:footer="708" w:gutter="0"/>
+          <w:pgNumType w:start="1"/>
+          <w:docGrid w:linePitch="360"/>
+        </w:sectPr>
+      </w:pPr>
+    </w:p>
+    <w:p>
+      <w:pPr>
         <w:pStyle w:val="Heading2"/>
-        <w:pageBreakBefore/>
         <w:spacing w:after="100" w:before="0"/>
       </w:pPr>
       <w:r>
@@ -26753,7 +26928,7 @@
               </w:rPr>
               <w:t xml:space="preserve">Nghe: </w:t>
             </w:r>
-            <w:hyperlink w:history="1" r:id="rId2pxmvad41qdxsgqiqsu1s">
+            <w:hyperlink w:history="1" r:id="rId-zqyoglctb9owz3jv3ikd">
               <w:r>
                 <w:rPr>
                   <w:rStyle w:val="Hyperlink"/>
@@ -26821,7 +26996,7 @@
                           </pic:cNvPicPr>
                         </pic:nvPicPr>
                         <pic:blipFill>
-                          <a:blip r:embed="rId23" cstate="none"/>
+                          <a:blip r:embed="rId47" cstate="none"/>
                           <a:srcRect/>
                           <a:stretch>
                             <a:fillRect/>
@@ -28207,8 +28382,19 @@
     </w:tbl>
     <w:p>
       <w:pPr>
+        <w:sectPr>
+          <w:footerReference w:type="default" r:id="rId23"/>
+          <w:type w:val="oddPage"/>
+          <w:pgSz w:w="11906" w:h="16838" w:orient="portrait"/>
+          <w:pgMar w:top="1000" w:right="1417" w:bottom="900" w:left="1417" w:header="708" w:footer="708" w:gutter="0"/>
+          <w:pgNumType w:start="1"/>
+          <w:docGrid w:linePitch="360"/>
+        </w:sectPr>
+      </w:pPr>
+    </w:p>
+    <w:p>
+      <w:pPr>
         <w:pStyle w:val="Heading2"/>
-        <w:pageBreakBefore/>
         <w:spacing w:after="100" w:before="0"/>
       </w:pPr>
       <w:r>
@@ -28311,7 +28497,7 @@
               </w:rPr>
               <w:t xml:space="preserve">Nghe: </w:t>
             </w:r>
-            <w:hyperlink w:history="1" r:id="rId8r2z_26c8twj3f5x3yrka">
+            <w:hyperlink w:history="1" r:id="rIdpzmyyb1gg4qm6ub3x_kc9">
               <w:r>
                 <w:rPr>
                   <w:rStyle w:val="Hyperlink"/>
@@ -28379,7 +28565,7 @@
                           </pic:cNvPicPr>
                         </pic:nvPicPr>
                         <pic:blipFill>
-                          <a:blip r:embed="rId24" cstate="none"/>
+                          <a:blip r:embed="rId48" cstate="none"/>
                           <a:srcRect/>
                           <a:stretch>
                             <a:fillRect/>
@@ -29765,8 +29951,19 @@
     </w:tbl>
     <w:p>
       <w:pPr>
+        <w:sectPr>
+          <w:footerReference w:type="default" r:id="rId24"/>
+          <w:type w:val="oddPage"/>
+          <w:pgSz w:w="11906" w:h="16838" w:orient="portrait"/>
+          <w:pgMar w:top="1000" w:right="1417" w:bottom="900" w:left="1417" w:header="708" w:footer="708" w:gutter="0"/>
+          <w:pgNumType w:start="1"/>
+          <w:docGrid w:linePitch="360"/>
+        </w:sectPr>
+      </w:pPr>
+    </w:p>
+    <w:p>
+      <w:pPr>
         <w:pStyle w:val="Heading2"/>
-        <w:pageBreakBefore/>
         <w:spacing w:after="100" w:before="0"/>
       </w:pPr>
       <w:r>
@@ -29869,7 +30066,7 @@
               </w:rPr>
               <w:t xml:space="preserve">Nghe: </w:t>
             </w:r>
-            <w:hyperlink w:history="1" r:id="rIdftmrdi-ult4iow39lhqsy">
+            <w:hyperlink w:history="1" r:id="rIdwvmcgqsy6bojgbhzqkzqu">
               <w:r>
                 <w:rPr>
                   <w:rStyle w:val="Hyperlink"/>
@@ -29937,7 +30134,7 @@
                           </pic:cNvPicPr>
                         </pic:nvPicPr>
                         <pic:blipFill>
-                          <a:blip r:embed="rId25" cstate="none"/>
+                          <a:blip r:embed="rId49" cstate="none"/>
                           <a:srcRect/>
                           <a:stretch>
                             <a:fillRect/>
@@ -31323,8 +31520,19 @@
     </w:tbl>
     <w:p>
       <w:pPr>
+        <w:sectPr>
+          <w:footerReference w:type="default" r:id="rId25"/>
+          <w:type w:val="oddPage"/>
+          <w:pgSz w:w="11906" w:h="16838" w:orient="portrait"/>
+          <w:pgMar w:top="1000" w:right="1417" w:bottom="900" w:left="1417" w:header="708" w:footer="708" w:gutter="0"/>
+          <w:pgNumType w:start="1"/>
+          <w:docGrid w:linePitch="360"/>
+        </w:sectPr>
+      </w:pPr>
+    </w:p>
+    <w:p>
+      <w:pPr>
         <w:pStyle w:val="Heading2"/>
-        <w:pageBreakBefore/>
         <w:spacing w:after="100" w:before="0"/>
       </w:pPr>
       <w:r>
@@ -31427,7 +31635,7 @@
               </w:rPr>
               <w:t xml:space="preserve">Nghe: </w:t>
             </w:r>
-            <w:hyperlink w:history="1" r:id="rIdvvf2cunsgjhii9shcwdxn">
+            <w:hyperlink w:history="1" r:id="rIdgynbkaqkfrkbewoivqhpl">
               <w:r>
                 <w:rPr>
                   <w:rStyle w:val="Hyperlink"/>
@@ -31495,7 +31703,7 @@
                           </pic:cNvPicPr>
                         </pic:nvPicPr>
                         <pic:blipFill>
-                          <a:blip r:embed="rId26" cstate="none"/>
+                          <a:blip r:embed="rId50" cstate="none"/>
                           <a:srcRect/>
                           <a:stretch>
                             <a:fillRect/>
@@ -32881,8 +33089,19 @@
     </w:tbl>
     <w:p>
       <w:pPr>
+        <w:sectPr>
+          <w:footerReference w:type="default" r:id="rId26"/>
+          <w:type w:val="oddPage"/>
+          <w:pgSz w:w="11906" w:h="16838" w:orient="portrait"/>
+          <w:pgMar w:top="1000" w:right="1417" w:bottom="900" w:left="1417" w:header="708" w:footer="708" w:gutter="0"/>
+          <w:pgNumType w:start="1"/>
+          <w:docGrid w:linePitch="360"/>
+        </w:sectPr>
+      </w:pPr>
+    </w:p>
+    <w:p>
+      <w:pPr>
         <w:pStyle w:val="Heading2"/>
-        <w:pageBreakBefore/>
         <w:spacing w:after="100" w:before="0"/>
       </w:pPr>
       <w:r>
@@ -32985,7 +33204,7 @@
               </w:rPr>
               <w:t xml:space="preserve">Nghe: </w:t>
             </w:r>
-            <w:hyperlink w:history="1" r:id="rIdq4mpaftdqt2hclyoopbrh">
+            <w:hyperlink w:history="1" r:id="rIdn1fobu3rdijxosclwkxey">
               <w:r>
                 <w:rPr>
                   <w:rStyle w:val="Hyperlink"/>
@@ -33053,7 +33272,7 @@
                           </pic:cNvPicPr>
                         </pic:nvPicPr>
                         <pic:blipFill>
-                          <a:blip r:embed="rId27" cstate="none"/>
+                          <a:blip r:embed="rId51" cstate="none"/>
                           <a:srcRect/>
                           <a:stretch>
                             <a:fillRect/>
@@ -34439,8 +34658,19 @@
     </w:tbl>
     <w:p>
       <w:pPr>
+        <w:sectPr>
+          <w:footerReference w:type="default" r:id="rId27"/>
+          <w:type w:val="oddPage"/>
+          <w:pgSz w:w="11906" w:h="16838" w:orient="portrait"/>
+          <w:pgMar w:top="1000" w:right="1417" w:bottom="900" w:left="1417" w:header="708" w:footer="708" w:gutter="0"/>
+          <w:pgNumType w:start="1"/>
+          <w:docGrid w:linePitch="360"/>
+        </w:sectPr>
+      </w:pPr>
+    </w:p>
+    <w:p>
+      <w:pPr>
         <w:pStyle w:val="Heading2"/>
-        <w:pageBreakBefore/>
         <w:spacing w:after="100" w:before="0"/>
       </w:pPr>
       <w:r>
@@ -34543,7 +34773,7 @@
               </w:rPr>
               <w:t xml:space="preserve">Nghe: </w:t>
             </w:r>
-            <w:hyperlink w:history="1" r:id="rId2lhixon7zbkypcfddepg5">
+            <w:hyperlink w:history="1" r:id="rIdzjdcut--qiabycqqi8hnh">
               <w:r>
                 <w:rPr>
                   <w:rStyle w:val="Hyperlink"/>
@@ -34611,7 +34841,7 @@
                           </pic:cNvPicPr>
                         </pic:nvPicPr>
                         <pic:blipFill>
-                          <a:blip r:embed="rId28" cstate="none"/>
+                          <a:blip r:embed="rId52" cstate="none"/>
                           <a:srcRect/>
                           <a:stretch>
                             <a:fillRect/>
@@ -35997,8 +36227,19 @@
     </w:tbl>
     <w:p>
       <w:pPr>
+        <w:sectPr>
+          <w:footerReference w:type="default" r:id="rId28"/>
+          <w:type w:val="oddPage"/>
+          <w:pgSz w:w="11906" w:h="16838" w:orient="portrait"/>
+          <w:pgMar w:top="1000" w:right="1417" w:bottom="900" w:left="1417" w:header="708" w:footer="708" w:gutter="0"/>
+          <w:pgNumType w:start="1"/>
+          <w:docGrid w:linePitch="360"/>
+        </w:sectPr>
+      </w:pPr>
+    </w:p>
+    <w:p>
+      <w:pPr>
         <w:pStyle w:val="Heading2"/>
-        <w:pageBreakBefore/>
         <w:spacing w:after="100" w:before="0"/>
       </w:pPr>
       <w:r>
@@ -36101,7 +36342,7 @@
               </w:rPr>
               <w:t xml:space="preserve">Nghe: </w:t>
             </w:r>
-            <w:hyperlink w:history="1" r:id="rIduorishrbpittiikijybg4">
+            <w:hyperlink w:history="1" r:id="rIdt-py9s510d6bqb96cmvvk">
               <w:r>
                 <w:rPr>
                   <w:rStyle w:val="Hyperlink"/>
@@ -36169,7 +36410,7 @@
                           </pic:cNvPicPr>
                         </pic:nvPicPr>
                         <pic:blipFill>
-                          <a:blip r:embed="rId29" cstate="none"/>
+                          <a:blip r:embed="rId53" cstate="none"/>
                           <a:srcRect/>
                           <a:stretch>
                             <a:fillRect/>
@@ -37555,8 +37796,19 @@
     </w:tbl>
     <w:p>
       <w:pPr>
+        <w:sectPr>
+          <w:footerReference w:type="default" r:id="rId29"/>
+          <w:type w:val="oddPage"/>
+          <w:pgSz w:w="11906" w:h="16838" w:orient="portrait"/>
+          <w:pgMar w:top="1000" w:right="1417" w:bottom="900" w:left="1417" w:header="708" w:footer="708" w:gutter="0"/>
+          <w:pgNumType w:start="1"/>
+          <w:docGrid w:linePitch="360"/>
+        </w:sectPr>
+      </w:pPr>
+    </w:p>
+    <w:p>
+      <w:pPr>
         <w:pStyle w:val="Heading2"/>
-        <w:pageBreakBefore/>
         <w:spacing w:after="100" w:before="0"/>
       </w:pPr>
       <w:r>
@@ -37659,7 +37911,7 @@
               </w:rPr>
               <w:t xml:space="preserve">Nghe: </w:t>
             </w:r>
-            <w:hyperlink w:history="1" r:id="rIddxdzbat4c4jdlt8vm84f3">
+            <w:hyperlink w:history="1" r:id="rIdhdckxrbvcjnqfkpmj0_bu">
               <w:r>
                 <w:rPr>
                   <w:rStyle w:val="Hyperlink"/>
@@ -37727,7 +37979,7 @@
                           </pic:cNvPicPr>
                         </pic:nvPicPr>
                         <pic:blipFill>
-                          <a:blip r:embed="rId30" cstate="none"/>
+                          <a:blip r:embed="rId54" cstate="none"/>
                           <a:srcRect/>
                           <a:stretch>
                             <a:fillRect/>
@@ -39113,8 +39365,19 @@
     </w:tbl>
     <w:p>
       <w:pPr>
+        <w:sectPr>
+          <w:footerReference w:type="default" r:id="rId30"/>
+          <w:type w:val="oddPage"/>
+          <w:pgSz w:w="11906" w:h="16838" w:orient="portrait"/>
+          <w:pgMar w:top="1000" w:right="1417" w:bottom="900" w:left="1417" w:header="708" w:footer="708" w:gutter="0"/>
+          <w:pgNumType w:start="1"/>
+          <w:docGrid w:linePitch="360"/>
+        </w:sectPr>
+      </w:pPr>
+    </w:p>
+    <w:p>
+      <w:pPr>
         <w:pStyle w:val="Heading2"/>
-        <w:pageBreakBefore/>
         <w:spacing w:after="100" w:before="0"/>
       </w:pPr>
       <w:r>
@@ -39217,7 +39480,7 @@
               </w:rPr>
               <w:t xml:space="preserve">Nghe: </w:t>
             </w:r>
-            <w:hyperlink w:history="1" r:id="rIdtr-ai9exaxdx-nnchem2c">
+            <w:hyperlink w:history="1" r:id="rId0oom0aiymv2lv3vlfmhiy">
               <w:r>
                 <w:rPr>
                   <w:rStyle w:val="Hyperlink"/>
@@ -39285,7 +39548,7 @@
                           </pic:cNvPicPr>
                         </pic:nvPicPr>
                         <pic:blipFill>
-                          <a:blip r:embed="rId31" cstate="none"/>
+                          <a:blip r:embed="rId55" cstate="none"/>
                           <a:srcRect/>
                           <a:stretch>
                             <a:fillRect/>
@@ -40670,10 +40933,11 @@
       </w:tr>
     </w:tbl>
     <w:sectPr>
-      <w:footerReference w:type="default" r:id="rId7"/>
+      <w:footerReference w:type="default" r:id="rId31"/>
+      <w:type w:val="oddPage"/>
       <w:pgSz w:w="11906" w:h="16838" w:orient="portrait"/>
       <w:pgMar w:top="1000" w:right="1417" w:bottom="900" w:left="1417" w:header="708" w:footer="708" w:gutter="0"/>
-      <w:pgNumType/>
+      <w:pgNumType w:start="1"/>
       <w:docGrid w:linePitch="360"/>
     </w:sectPr>
   </w:body>
@@ -40735,6 +40999,750 @@
         <w:szCs w:val="16"/>
       </w:rPr>
       <w:t xml:space="preserve">Luyện nghe podcast YouTube – trang </w:t>
+    </w:r>
+    <w:r>
+      <w:rPr>
+        <w:rFonts w:ascii="Arial" w:cs="Arial" w:eastAsia="Arial" w:hAnsi="Arial"/>
+        <w:color w:val="808080"/>
+        <w:sz w:val="16"/>
+        <w:szCs w:val="16"/>
+      </w:rPr>
+      <w:fldChar w:fldCharType="begin"/>
+      <w:instrText xml:space="preserve">PAGE</w:instrText>
+      <w:fldChar w:fldCharType="separate"/>
+      <w:fldChar w:fldCharType="end"/>
+    </w:r>
+  </w:p>
+</w:ftr>
+</file>
+
+<file path=word/footer10.xml><?xml version="1.0" encoding="utf-8"?>
+<w:ftr xmlns:wpc="http://schemas.microsoft.com/office/word/2010/wordprocessingCanvas" xmlns:mc="http://schemas.openxmlformats.org/markup-compatibility/2006" xmlns:o="urn:schemas-microsoft-com:office:office" xmlns:r="http://schemas.openxmlformats.org/officeDocument/2006/relationships" xmlns:m="http://schemas.openxmlformats.org/officeDocument/2006/math" xmlns:v="urn:schemas-microsoft-com:vml" xmlns:wp14="http://schemas.microsoft.com/office/word/2010/wordprocessingDrawing" xmlns:wp="http://schemas.openxmlformats.org/drawingml/2006/wordprocessingDrawing" xmlns:w10="urn:schemas-microsoft-com:office:word" xmlns:w="http://schemas.openxmlformats.org/wordprocessingml/2006/main" xmlns:w14="http://schemas.microsoft.com/office/word/2010/wordml" xmlns:w15="http://schemas.microsoft.com/office/word/2012/wordml" xmlns:wpg="http://schemas.microsoft.com/office/word/2010/wordprocessingGroup" xmlns:wpi="http://schemas.microsoft.com/office/word/2010/wordprocessingInk" xmlns:wne="http://schemas.microsoft.com/office/word/2006/wordml" xmlns:wps="http://schemas.microsoft.com/office/word/2010/wordprocessingShape">
+  <w:p>
+    <w:pPr>
+      <w:jc w:val="center"/>
+    </w:pPr>
+    <w:r>
+      <w:rPr>
+        <w:rFonts w:ascii="Arial" w:cs="Arial" w:eastAsia="Arial" w:hAnsi="Arial"/>
+        <w:color w:val="808080"/>
+        <w:sz w:val="16"/>
+        <w:szCs w:val="16"/>
+      </w:rPr>
+      <w:t xml:space="preserve">Luyện nghe podcast YouTube – Bài 9 – trang </w:t>
+    </w:r>
+    <w:r>
+      <w:rPr>
+        <w:rFonts w:ascii="Arial" w:cs="Arial" w:eastAsia="Arial" w:hAnsi="Arial"/>
+        <w:color w:val="808080"/>
+        <w:sz w:val="16"/>
+        <w:szCs w:val="16"/>
+      </w:rPr>
+      <w:fldChar w:fldCharType="begin"/>
+      <w:instrText xml:space="preserve">PAGE</w:instrText>
+      <w:fldChar w:fldCharType="separate"/>
+      <w:fldChar w:fldCharType="end"/>
+    </w:r>
+  </w:p>
+</w:ftr>
+</file>
+
+<file path=word/footer11.xml><?xml version="1.0" encoding="utf-8"?>
+<w:ftr xmlns:wpc="http://schemas.microsoft.com/office/word/2010/wordprocessingCanvas" xmlns:mc="http://schemas.openxmlformats.org/markup-compatibility/2006" xmlns:o="urn:schemas-microsoft-com:office:office" xmlns:r="http://schemas.openxmlformats.org/officeDocument/2006/relationships" xmlns:m="http://schemas.openxmlformats.org/officeDocument/2006/math" xmlns:v="urn:schemas-microsoft-com:vml" xmlns:wp14="http://schemas.microsoft.com/office/word/2010/wordprocessingDrawing" xmlns:wp="http://schemas.openxmlformats.org/drawingml/2006/wordprocessingDrawing" xmlns:w10="urn:schemas-microsoft-com:office:word" xmlns:w="http://schemas.openxmlformats.org/wordprocessingml/2006/main" xmlns:w14="http://schemas.microsoft.com/office/word/2010/wordml" xmlns:w15="http://schemas.microsoft.com/office/word/2012/wordml" xmlns:wpg="http://schemas.microsoft.com/office/word/2010/wordprocessingGroup" xmlns:wpi="http://schemas.microsoft.com/office/word/2010/wordprocessingInk" xmlns:wne="http://schemas.microsoft.com/office/word/2006/wordml" xmlns:wps="http://schemas.microsoft.com/office/word/2010/wordprocessingShape">
+  <w:p>
+    <w:pPr>
+      <w:jc w:val="center"/>
+    </w:pPr>
+    <w:r>
+      <w:rPr>
+        <w:rFonts w:ascii="Arial" w:cs="Arial" w:eastAsia="Arial" w:hAnsi="Arial"/>
+        <w:color w:val="808080"/>
+        <w:sz w:val="16"/>
+        <w:szCs w:val="16"/>
+      </w:rPr>
+      <w:t xml:space="preserve">Luyện nghe podcast YouTube – Bài 10 – trang </w:t>
+    </w:r>
+    <w:r>
+      <w:rPr>
+        <w:rFonts w:ascii="Arial" w:cs="Arial" w:eastAsia="Arial" w:hAnsi="Arial"/>
+        <w:color w:val="808080"/>
+        <w:sz w:val="16"/>
+        <w:szCs w:val="16"/>
+      </w:rPr>
+      <w:fldChar w:fldCharType="begin"/>
+      <w:instrText xml:space="preserve">PAGE</w:instrText>
+      <w:fldChar w:fldCharType="separate"/>
+      <w:fldChar w:fldCharType="end"/>
+    </w:r>
+  </w:p>
+</w:ftr>
+</file>
+
+<file path=word/footer12.xml><?xml version="1.0" encoding="utf-8"?>
+<w:ftr xmlns:wpc="http://schemas.microsoft.com/office/word/2010/wordprocessingCanvas" xmlns:mc="http://schemas.openxmlformats.org/markup-compatibility/2006" xmlns:o="urn:schemas-microsoft-com:office:office" xmlns:r="http://schemas.openxmlformats.org/officeDocument/2006/relationships" xmlns:m="http://schemas.openxmlformats.org/officeDocument/2006/math" xmlns:v="urn:schemas-microsoft-com:vml" xmlns:wp14="http://schemas.microsoft.com/office/word/2010/wordprocessingDrawing" xmlns:wp="http://schemas.openxmlformats.org/drawingml/2006/wordprocessingDrawing" xmlns:w10="urn:schemas-microsoft-com:office:word" xmlns:w="http://schemas.openxmlformats.org/wordprocessingml/2006/main" xmlns:w14="http://schemas.microsoft.com/office/word/2010/wordml" xmlns:w15="http://schemas.microsoft.com/office/word/2012/wordml" xmlns:wpg="http://schemas.microsoft.com/office/word/2010/wordprocessingGroup" xmlns:wpi="http://schemas.microsoft.com/office/word/2010/wordprocessingInk" xmlns:wne="http://schemas.microsoft.com/office/word/2006/wordml" xmlns:wps="http://schemas.microsoft.com/office/word/2010/wordprocessingShape">
+  <w:p>
+    <w:pPr>
+      <w:jc w:val="center"/>
+    </w:pPr>
+    <w:r>
+      <w:rPr>
+        <w:rFonts w:ascii="Arial" w:cs="Arial" w:eastAsia="Arial" w:hAnsi="Arial"/>
+        <w:color w:val="808080"/>
+        <w:sz w:val="16"/>
+        <w:szCs w:val="16"/>
+      </w:rPr>
+      <w:t xml:space="preserve">Luyện nghe podcast YouTube – Bài 11 – trang </w:t>
+    </w:r>
+    <w:r>
+      <w:rPr>
+        <w:rFonts w:ascii="Arial" w:cs="Arial" w:eastAsia="Arial" w:hAnsi="Arial"/>
+        <w:color w:val="808080"/>
+        <w:sz w:val="16"/>
+        <w:szCs w:val="16"/>
+      </w:rPr>
+      <w:fldChar w:fldCharType="begin"/>
+      <w:instrText xml:space="preserve">PAGE</w:instrText>
+      <w:fldChar w:fldCharType="separate"/>
+      <w:fldChar w:fldCharType="end"/>
+    </w:r>
+  </w:p>
+</w:ftr>
+</file>
+
+<file path=word/footer13.xml><?xml version="1.0" encoding="utf-8"?>
+<w:ftr xmlns:wpc="http://schemas.microsoft.com/office/word/2010/wordprocessingCanvas" xmlns:mc="http://schemas.openxmlformats.org/markup-compatibility/2006" xmlns:o="urn:schemas-microsoft-com:office:office" xmlns:r="http://schemas.openxmlformats.org/officeDocument/2006/relationships" xmlns:m="http://schemas.openxmlformats.org/officeDocument/2006/math" xmlns:v="urn:schemas-microsoft-com:vml" xmlns:wp14="http://schemas.microsoft.com/office/word/2010/wordprocessingDrawing" xmlns:wp="http://schemas.openxmlformats.org/drawingml/2006/wordprocessingDrawing" xmlns:w10="urn:schemas-microsoft-com:office:word" xmlns:w="http://schemas.openxmlformats.org/wordprocessingml/2006/main" xmlns:w14="http://schemas.microsoft.com/office/word/2010/wordml" xmlns:w15="http://schemas.microsoft.com/office/word/2012/wordml" xmlns:wpg="http://schemas.microsoft.com/office/word/2010/wordprocessingGroup" xmlns:wpi="http://schemas.microsoft.com/office/word/2010/wordprocessingInk" xmlns:wne="http://schemas.microsoft.com/office/word/2006/wordml" xmlns:wps="http://schemas.microsoft.com/office/word/2010/wordprocessingShape">
+  <w:p>
+    <w:pPr>
+      <w:jc w:val="center"/>
+    </w:pPr>
+    <w:r>
+      <w:rPr>
+        <w:rFonts w:ascii="Arial" w:cs="Arial" w:eastAsia="Arial" w:hAnsi="Arial"/>
+        <w:color w:val="808080"/>
+        <w:sz w:val="16"/>
+        <w:szCs w:val="16"/>
+      </w:rPr>
+      <w:t xml:space="preserve">Luyện nghe podcast YouTube – Bài 12 – trang </w:t>
+    </w:r>
+    <w:r>
+      <w:rPr>
+        <w:rFonts w:ascii="Arial" w:cs="Arial" w:eastAsia="Arial" w:hAnsi="Arial"/>
+        <w:color w:val="808080"/>
+        <w:sz w:val="16"/>
+        <w:szCs w:val="16"/>
+      </w:rPr>
+      <w:fldChar w:fldCharType="begin"/>
+      <w:instrText xml:space="preserve">PAGE</w:instrText>
+      <w:fldChar w:fldCharType="separate"/>
+      <w:fldChar w:fldCharType="end"/>
+    </w:r>
+  </w:p>
+</w:ftr>
+</file>
+
+<file path=word/footer14.xml><?xml version="1.0" encoding="utf-8"?>
+<w:ftr xmlns:wpc="http://schemas.microsoft.com/office/word/2010/wordprocessingCanvas" xmlns:mc="http://schemas.openxmlformats.org/markup-compatibility/2006" xmlns:o="urn:schemas-microsoft-com:office:office" xmlns:r="http://schemas.openxmlformats.org/officeDocument/2006/relationships" xmlns:m="http://schemas.openxmlformats.org/officeDocument/2006/math" xmlns:v="urn:schemas-microsoft-com:vml" xmlns:wp14="http://schemas.microsoft.com/office/word/2010/wordprocessingDrawing" xmlns:wp="http://schemas.openxmlformats.org/drawingml/2006/wordprocessingDrawing" xmlns:w10="urn:schemas-microsoft-com:office:word" xmlns:w="http://schemas.openxmlformats.org/wordprocessingml/2006/main" xmlns:w14="http://schemas.microsoft.com/office/word/2010/wordml" xmlns:w15="http://schemas.microsoft.com/office/word/2012/wordml" xmlns:wpg="http://schemas.microsoft.com/office/word/2010/wordprocessingGroup" xmlns:wpi="http://schemas.microsoft.com/office/word/2010/wordprocessingInk" xmlns:wne="http://schemas.microsoft.com/office/word/2006/wordml" xmlns:wps="http://schemas.microsoft.com/office/word/2010/wordprocessingShape">
+  <w:p>
+    <w:pPr>
+      <w:jc w:val="center"/>
+    </w:pPr>
+    <w:r>
+      <w:rPr>
+        <w:rFonts w:ascii="Arial" w:cs="Arial" w:eastAsia="Arial" w:hAnsi="Arial"/>
+        <w:color w:val="808080"/>
+        <w:sz w:val="16"/>
+        <w:szCs w:val="16"/>
+      </w:rPr>
+      <w:t xml:space="preserve">Luyện nghe podcast YouTube – Bài 13 – trang </w:t>
+    </w:r>
+    <w:r>
+      <w:rPr>
+        <w:rFonts w:ascii="Arial" w:cs="Arial" w:eastAsia="Arial" w:hAnsi="Arial"/>
+        <w:color w:val="808080"/>
+        <w:sz w:val="16"/>
+        <w:szCs w:val="16"/>
+      </w:rPr>
+      <w:fldChar w:fldCharType="begin"/>
+      <w:instrText xml:space="preserve">PAGE</w:instrText>
+      <w:fldChar w:fldCharType="separate"/>
+      <w:fldChar w:fldCharType="end"/>
+    </w:r>
+  </w:p>
+</w:ftr>
+</file>
+
+<file path=word/footer15.xml><?xml version="1.0" encoding="utf-8"?>
+<w:ftr xmlns:wpc="http://schemas.microsoft.com/office/word/2010/wordprocessingCanvas" xmlns:mc="http://schemas.openxmlformats.org/markup-compatibility/2006" xmlns:o="urn:schemas-microsoft-com:office:office" xmlns:r="http://schemas.openxmlformats.org/officeDocument/2006/relationships" xmlns:m="http://schemas.openxmlformats.org/officeDocument/2006/math" xmlns:v="urn:schemas-microsoft-com:vml" xmlns:wp14="http://schemas.microsoft.com/office/word/2010/wordprocessingDrawing" xmlns:wp="http://schemas.openxmlformats.org/drawingml/2006/wordprocessingDrawing" xmlns:w10="urn:schemas-microsoft-com:office:word" xmlns:w="http://schemas.openxmlformats.org/wordprocessingml/2006/main" xmlns:w14="http://schemas.microsoft.com/office/word/2010/wordml" xmlns:w15="http://schemas.microsoft.com/office/word/2012/wordml" xmlns:wpg="http://schemas.microsoft.com/office/word/2010/wordprocessingGroup" xmlns:wpi="http://schemas.microsoft.com/office/word/2010/wordprocessingInk" xmlns:wne="http://schemas.microsoft.com/office/word/2006/wordml" xmlns:wps="http://schemas.microsoft.com/office/word/2010/wordprocessingShape">
+  <w:p>
+    <w:pPr>
+      <w:jc w:val="center"/>
+    </w:pPr>
+    <w:r>
+      <w:rPr>
+        <w:rFonts w:ascii="Arial" w:cs="Arial" w:eastAsia="Arial" w:hAnsi="Arial"/>
+        <w:color w:val="808080"/>
+        <w:sz w:val="16"/>
+        <w:szCs w:val="16"/>
+      </w:rPr>
+      <w:t xml:space="preserve">Luyện nghe podcast YouTube – Bài 14 – trang </w:t>
+    </w:r>
+    <w:r>
+      <w:rPr>
+        <w:rFonts w:ascii="Arial" w:cs="Arial" w:eastAsia="Arial" w:hAnsi="Arial"/>
+        <w:color w:val="808080"/>
+        <w:sz w:val="16"/>
+        <w:szCs w:val="16"/>
+      </w:rPr>
+      <w:fldChar w:fldCharType="begin"/>
+      <w:instrText xml:space="preserve">PAGE</w:instrText>
+      <w:fldChar w:fldCharType="separate"/>
+      <w:fldChar w:fldCharType="end"/>
+    </w:r>
+  </w:p>
+</w:ftr>
+</file>
+
+<file path=word/footer16.xml><?xml version="1.0" encoding="utf-8"?>
+<w:ftr xmlns:wpc="http://schemas.microsoft.com/office/word/2010/wordprocessingCanvas" xmlns:mc="http://schemas.openxmlformats.org/markup-compatibility/2006" xmlns:o="urn:schemas-microsoft-com:office:office" xmlns:r="http://schemas.openxmlformats.org/officeDocument/2006/relationships" xmlns:m="http://schemas.openxmlformats.org/officeDocument/2006/math" xmlns:v="urn:schemas-microsoft-com:vml" xmlns:wp14="http://schemas.microsoft.com/office/word/2010/wordprocessingDrawing" xmlns:wp="http://schemas.openxmlformats.org/drawingml/2006/wordprocessingDrawing" xmlns:w10="urn:schemas-microsoft-com:office:word" xmlns:w="http://schemas.openxmlformats.org/wordprocessingml/2006/main" xmlns:w14="http://schemas.microsoft.com/office/word/2010/wordml" xmlns:w15="http://schemas.microsoft.com/office/word/2012/wordml" xmlns:wpg="http://schemas.microsoft.com/office/word/2010/wordprocessingGroup" xmlns:wpi="http://schemas.microsoft.com/office/word/2010/wordprocessingInk" xmlns:wne="http://schemas.microsoft.com/office/word/2006/wordml" xmlns:wps="http://schemas.microsoft.com/office/word/2010/wordprocessingShape">
+  <w:p>
+    <w:pPr>
+      <w:jc w:val="center"/>
+    </w:pPr>
+    <w:r>
+      <w:rPr>
+        <w:rFonts w:ascii="Arial" w:cs="Arial" w:eastAsia="Arial" w:hAnsi="Arial"/>
+        <w:color w:val="808080"/>
+        <w:sz w:val="16"/>
+        <w:szCs w:val="16"/>
+      </w:rPr>
+      <w:t xml:space="preserve">Luyện nghe podcast YouTube – Bài 15 – trang </w:t>
+    </w:r>
+    <w:r>
+      <w:rPr>
+        <w:rFonts w:ascii="Arial" w:cs="Arial" w:eastAsia="Arial" w:hAnsi="Arial"/>
+        <w:color w:val="808080"/>
+        <w:sz w:val="16"/>
+        <w:szCs w:val="16"/>
+      </w:rPr>
+      <w:fldChar w:fldCharType="begin"/>
+      <w:instrText xml:space="preserve">PAGE</w:instrText>
+      <w:fldChar w:fldCharType="separate"/>
+      <w:fldChar w:fldCharType="end"/>
+    </w:r>
+  </w:p>
+</w:ftr>
+</file>
+
+<file path=word/footer17.xml><?xml version="1.0" encoding="utf-8"?>
+<w:ftr xmlns:wpc="http://schemas.microsoft.com/office/word/2010/wordprocessingCanvas" xmlns:mc="http://schemas.openxmlformats.org/markup-compatibility/2006" xmlns:o="urn:schemas-microsoft-com:office:office" xmlns:r="http://schemas.openxmlformats.org/officeDocument/2006/relationships" xmlns:m="http://schemas.openxmlformats.org/officeDocument/2006/math" xmlns:v="urn:schemas-microsoft-com:vml" xmlns:wp14="http://schemas.microsoft.com/office/word/2010/wordprocessingDrawing" xmlns:wp="http://schemas.openxmlformats.org/drawingml/2006/wordprocessingDrawing" xmlns:w10="urn:schemas-microsoft-com:office:word" xmlns:w="http://schemas.openxmlformats.org/wordprocessingml/2006/main" xmlns:w14="http://schemas.microsoft.com/office/word/2010/wordml" xmlns:w15="http://schemas.microsoft.com/office/word/2012/wordml" xmlns:wpg="http://schemas.microsoft.com/office/word/2010/wordprocessingGroup" xmlns:wpi="http://schemas.microsoft.com/office/word/2010/wordprocessingInk" xmlns:wne="http://schemas.microsoft.com/office/word/2006/wordml" xmlns:wps="http://schemas.microsoft.com/office/word/2010/wordprocessingShape">
+  <w:p>
+    <w:pPr>
+      <w:jc w:val="center"/>
+    </w:pPr>
+    <w:r>
+      <w:rPr>
+        <w:rFonts w:ascii="Arial" w:cs="Arial" w:eastAsia="Arial" w:hAnsi="Arial"/>
+        <w:color w:val="808080"/>
+        <w:sz w:val="16"/>
+        <w:szCs w:val="16"/>
+      </w:rPr>
+      <w:t xml:space="preserve">Luyện nghe podcast YouTube – Bài 16 – trang </w:t>
+    </w:r>
+    <w:r>
+      <w:rPr>
+        <w:rFonts w:ascii="Arial" w:cs="Arial" w:eastAsia="Arial" w:hAnsi="Arial"/>
+        <w:color w:val="808080"/>
+        <w:sz w:val="16"/>
+        <w:szCs w:val="16"/>
+      </w:rPr>
+      <w:fldChar w:fldCharType="begin"/>
+      <w:instrText xml:space="preserve">PAGE</w:instrText>
+      <w:fldChar w:fldCharType="separate"/>
+      <w:fldChar w:fldCharType="end"/>
+    </w:r>
+  </w:p>
+</w:ftr>
+</file>
+
+<file path=word/footer18.xml><?xml version="1.0" encoding="utf-8"?>
+<w:ftr xmlns:wpc="http://schemas.microsoft.com/office/word/2010/wordprocessingCanvas" xmlns:mc="http://schemas.openxmlformats.org/markup-compatibility/2006" xmlns:o="urn:schemas-microsoft-com:office:office" xmlns:r="http://schemas.openxmlformats.org/officeDocument/2006/relationships" xmlns:m="http://schemas.openxmlformats.org/officeDocument/2006/math" xmlns:v="urn:schemas-microsoft-com:vml" xmlns:wp14="http://schemas.microsoft.com/office/word/2010/wordprocessingDrawing" xmlns:wp="http://schemas.openxmlformats.org/drawingml/2006/wordprocessingDrawing" xmlns:w10="urn:schemas-microsoft-com:office:word" xmlns:w="http://schemas.openxmlformats.org/wordprocessingml/2006/main" xmlns:w14="http://schemas.microsoft.com/office/word/2010/wordml" xmlns:w15="http://schemas.microsoft.com/office/word/2012/wordml" xmlns:wpg="http://schemas.microsoft.com/office/word/2010/wordprocessingGroup" xmlns:wpi="http://schemas.microsoft.com/office/word/2010/wordprocessingInk" xmlns:wne="http://schemas.microsoft.com/office/word/2006/wordml" xmlns:wps="http://schemas.microsoft.com/office/word/2010/wordprocessingShape">
+  <w:p>
+    <w:pPr>
+      <w:jc w:val="center"/>
+    </w:pPr>
+    <w:r>
+      <w:rPr>
+        <w:rFonts w:ascii="Arial" w:cs="Arial" w:eastAsia="Arial" w:hAnsi="Arial"/>
+        <w:color w:val="808080"/>
+        <w:sz w:val="16"/>
+        <w:szCs w:val="16"/>
+      </w:rPr>
+      <w:t xml:space="preserve">Luyện nghe podcast YouTube – Bài 17 – trang </w:t>
+    </w:r>
+    <w:r>
+      <w:rPr>
+        <w:rFonts w:ascii="Arial" w:cs="Arial" w:eastAsia="Arial" w:hAnsi="Arial"/>
+        <w:color w:val="808080"/>
+        <w:sz w:val="16"/>
+        <w:szCs w:val="16"/>
+      </w:rPr>
+      <w:fldChar w:fldCharType="begin"/>
+      <w:instrText xml:space="preserve">PAGE</w:instrText>
+      <w:fldChar w:fldCharType="separate"/>
+      <w:fldChar w:fldCharType="end"/>
+    </w:r>
+  </w:p>
+</w:ftr>
+</file>
+
+<file path=word/footer19.xml><?xml version="1.0" encoding="utf-8"?>
+<w:ftr xmlns:wpc="http://schemas.microsoft.com/office/word/2010/wordprocessingCanvas" xmlns:mc="http://schemas.openxmlformats.org/markup-compatibility/2006" xmlns:o="urn:schemas-microsoft-com:office:office" xmlns:r="http://schemas.openxmlformats.org/officeDocument/2006/relationships" xmlns:m="http://schemas.openxmlformats.org/officeDocument/2006/math" xmlns:v="urn:schemas-microsoft-com:vml" xmlns:wp14="http://schemas.microsoft.com/office/word/2010/wordprocessingDrawing" xmlns:wp="http://schemas.openxmlformats.org/drawingml/2006/wordprocessingDrawing" xmlns:w10="urn:schemas-microsoft-com:office:word" xmlns:w="http://schemas.openxmlformats.org/wordprocessingml/2006/main" xmlns:w14="http://schemas.microsoft.com/office/word/2010/wordml" xmlns:w15="http://schemas.microsoft.com/office/word/2012/wordml" xmlns:wpg="http://schemas.microsoft.com/office/word/2010/wordprocessingGroup" xmlns:wpi="http://schemas.microsoft.com/office/word/2010/wordprocessingInk" xmlns:wne="http://schemas.microsoft.com/office/word/2006/wordml" xmlns:wps="http://schemas.microsoft.com/office/word/2010/wordprocessingShape">
+  <w:p>
+    <w:pPr>
+      <w:jc w:val="center"/>
+    </w:pPr>
+    <w:r>
+      <w:rPr>
+        <w:rFonts w:ascii="Arial" w:cs="Arial" w:eastAsia="Arial" w:hAnsi="Arial"/>
+        <w:color w:val="808080"/>
+        <w:sz w:val="16"/>
+        <w:szCs w:val="16"/>
+      </w:rPr>
+      <w:t xml:space="preserve">Luyện nghe podcast YouTube – Bài 18 – trang </w:t>
+    </w:r>
+    <w:r>
+      <w:rPr>
+        <w:rFonts w:ascii="Arial" w:cs="Arial" w:eastAsia="Arial" w:hAnsi="Arial"/>
+        <w:color w:val="808080"/>
+        <w:sz w:val="16"/>
+        <w:szCs w:val="16"/>
+      </w:rPr>
+      <w:fldChar w:fldCharType="begin"/>
+      <w:instrText xml:space="preserve">PAGE</w:instrText>
+      <w:fldChar w:fldCharType="separate"/>
+      <w:fldChar w:fldCharType="end"/>
+    </w:r>
+  </w:p>
+</w:ftr>
+</file>
+
+<file path=word/footer2.xml><?xml version="1.0" encoding="utf-8"?>
+<w:ftr xmlns:wpc="http://schemas.microsoft.com/office/word/2010/wordprocessingCanvas" xmlns:mc="http://schemas.openxmlformats.org/markup-compatibility/2006" xmlns:o="urn:schemas-microsoft-com:office:office" xmlns:r="http://schemas.openxmlformats.org/officeDocument/2006/relationships" xmlns:m="http://schemas.openxmlformats.org/officeDocument/2006/math" xmlns:v="urn:schemas-microsoft-com:vml" xmlns:wp14="http://schemas.microsoft.com/office/word/2010/wordprocessingDrawing" xmlns:wp="http://schemas.openxmlformats.org/drawingml/2006/wordprocessingDrawing" xmlns:w10="urn:schemas-microsoft-com:office:word" xmlns:w="http://schemas.openxmlformats.org/wordprocessingml/2006/main" xmlns:w14="http://schemas.microsoft.com/office/word/2010/wordml" xmlns:w15="http://schemas.microsoft.com/office/word/2012/wordml" xmlns:wpg="http://schemas.microsoft.com/office/word/2010/wordprocessingGroup" xmlns:wpi="http://schemas.microsoft.com/office/word/2010/wordprocessingInk" xmlns:wne="http://schemas.microsoft.com/office/word/2006/wordml" xmlns:wps="http://schemas.microsoft.com/office/word/2010/wordprocessingShape">
+  <w:p>
+    <w:pPr>
+      <w:jc w:val="center"/>
+    </w:pPr>
+    <w:r>
+      <w:rPr>
+        <w:rFonts w:ascii="Arial" w:cs="Arial" w:eastAsia="Arial" w:hAnsi="Arial"/>
+        <w:color w:val="808080"/>
+        <w:sz w:val="16"/>
+        <w:szCs w:val="16"/>
+      </w:rPr>
+      <w:t xml:space="preserve">Luyện nghe podcast YouTube – Bài 1 – trang </w:t>
+    </w:r>
+    <w:r>
+      <w:rPr>
+        <w:rFonts w:ascii="Arial" w:cs="Arial" w:eastAsia="Arial" w:hAnsi="Arial"/>
+        <w:color w:val="808080"/>
+        <w:sz w:val="16"/>
+        <w:szCs w:val="16"/>
+      </w:rPr>
+      <w:fldChar w:fldCharType="begin"/>
+      <w:instrText xml:space="preserve">PAGE</w:instrText>
+      <w:fldChar w:fldCharType="separate"/>
+      <w:fldChar w:fldCharType="end"/>
+    </w:r>
+  </w:p>
+</w:ftr>
+</file>
+
+<file path=word/footer20.xml><?xml version="1.0" encoding="utf-8"?>
+<w:ftr xmlns:wpc="http://schemas.microsoft.com/office/word/2010/wordprocessingCanvas" xmlns:mc="http://schemas.openxmlformats.org/markup-compatibility/2006" xmlns:o="urn:schemas-microsoft-com:office:office" xmlns:r="http://schemas.openxmlformats.org/officeDocument/2006/relationships" xmlns:m="http://schemas.openxmlformats.org/officeDocument/2006/math" xmlns:v="urn:schemas-microsoft-com:vml" xmlns:wp14="http://schemas.microsoft.com/office/word/2010/wordprocessingDrawing" xmlns:wp="http://schemas.openxmlformats.org/drawingml/2006/wordprocessingDrawing" xmlns:w10="urn:schemas-microsoft-com:office:word" xmlns:w="http://schemas.openxmlformats.org/wordprocessingml/2006/main" xmlns:w14="http://schemas.microsoft.com/office/word/2010/wordml" xmlns:w15="http://schemas.microsoft.com/office/word/2012/wordml" xmlns:wpg="http://schemas.microsoft.com/office/word/2010/wordprocessingGroup" xmlns:wpi="http://schemas.microsoft.com/office/word/2010/wordprocessingInk" xmlns:wne="http://schemas.microsoft.com/office/word/2006/wordml" xmlns:wps="http://schemas.microsoft.com/office/word/2010/wordprocessingShape">
+  <w:p>
+    <w:pPr>
+      <w:jc w:val="center"/>
+    </w:pPr>
+    <w:r>
+      <w:rPr>
+        <w:rFonts w:ascii="Arial" w:cs="Arial" w:eastAsia="Arial" w:hAnsi="Arial"/>
+        <w:color w:val="808080"/>
+        <w:sz w:val="16"/>
+        <w:szCs w:val="16"/>
+      </w:rPr>
+      <w:t xml:space="preserve">Luyện nghe podcast YouTube – Bài 19 – trang </w:t>
+    </w:r>
+    <w:r>
+      <w:rPr>
+        <w:rFonts w:ascii="Arial" w:cs="Arial" w:eastAsia="Arial" w:hAnsi="Arial"/>
+        <w:color w:val="808080"/>
+        <w:sz w:val="16"/>
+        <w:szCs w:val="16"/>
+      </w:rPr>
+      <w:fldChar w:fldCharType="begin"/>
+      <w:instrText xml:space="preserve">PAGE</w:instrText>
+      <w:fldChar w:fldCharType="separate"/>
+      <w:fldChar w:fldCharType="end"/>
+    </w:r>
+  </w:p>
+</w:ftr>
+</file>
+
+<file path=word/footer21.xml><?xml version="1.0" encoding="utf-8"?>
+<w:ftr xmlns:wpc="http://schemas.microsoft.com/office/word/2010/wordprocessingCanvas" xmlns:mc="http://schemas.openxmlformats.org/markup-compatibility/2006" xmlns:o="urn:schemas-microsoft-com:office:office" xmlns:r="http://schemas.openxmlformats.org/officeDocument/2006/relationships" xmlns:m="http://schemas.openxmlformats.org/officeDocument/2006/math" xmlns:v="urn:schemas-microsoft-com:vml" xmlns:wp14="http://schemas.microsoft.com/office/word/2010/wordprocessingDrawing" xmlns:wp="http://schemas.openxmlformats.org/drawingml/2006/wordprocessingDrawing" xmlns:w10="urn:schemas-microsoft-com:office:word" xmlns:w="http://schemas.openxmlformats.org/wordprocessingml/2006/main" xmlns:w14="http://schemas.microsoft.com/office/word/2010/wordml" xmlns:w15="http://schemas.microsoft.com/office/word/2012/wordml" xmlns:wpg="http://schemas.microsoft.com/office/word/2010/wordprocessingGroup" xmlns:wpi="http://schemas.microsoft.com/office/word/2010/wordprocessingInk" xmlns:wne="http://schemas.microsoft.com/office/word/2006/wordml" xmlns:wps="http://schemas.microsoft.com/office/word/2010/wordprocessingShape">
+  <w:p>
+    <w:pPr>
+      <w:jc w:val="center"/>
+    </w:pPr>
+    <w:r>
+      <w:rPr>
+        <w:rFonts w:ascii="Arial" w:cs="Arial" w:eastAsia="Arial" w:hAnsi="Arial"/>
+        <w:color w:val="808080"/>
+        <w:sz w:val="16"/>
+        <w:szCs w:val="16"/>
+      </w:rPr>
+      <w:t xml:space="preserve">Luyện nghe podcast YouTube – Bài 20 – trang </w:t>
+    </w:r>
+    <w:r>
+      <w:rPr>
+        <w:rFonts w:ascii="Arial" w:cs="Arial" w:eastAsia="Arial" w:hAnsi="Arial"/>
+        <w:color w:val="808080"/>
+        <w:sz w:val="16"/>
+        <w:szCs w:val="16"/>
+      </w:rPr>
+      <w:fldChar w:fldCharType="begin"/>
+      <w:instrText xml:space="preserve">PAGE</w:instrText>
+      <w:fldChar w:fldCharType="separate"/>
+      <w:fldChar w:fldCharType="end"/>
+    </w:r>
+  </w:p>
+</w:ftr>
+</file>
+
+<file path=word/footer22.xml><?xml version="1.0" encoding="utf-8"?>
+<w:ftr xmlns:wpc="http://schemas.microsoft.com/office/word/2010/wordprocessingCanvas" xmlns:mc="http://schemas.openxmlformats.org/markup-compatibility/2006" xmlns:o="urn:schemas-microsoft-com:office:office" xmlns:r="http://schemas.openxmlformats.org/officeDocument/2006/relationships" xmlns:m="http://schemas.openxmlformats.org/officeDocument/2006/math" xmlns:v="urn:schemas-microsoft-com:vml" xmlns:wp14="http://schemas.microsoft.com/office/word/2010/wordprocessingDrawing" xmlns:wp="http://schemas.openxmlformats.org/drawingml/2006/wordprocessingDrawing" xmlns:w10="urn:schemas-microsoft-com:office:word" xmlns:w="http://schemas.openxmlformats.org/wordprocessingml/2006/main" xmlns:w14="http://schemas.microsoft.com/office/word/2010/wordml" xmlns:w15="http://schemas.microsoft.com/office/word/2012/wordml" xmlns:wpg="http://schemas.microsoft.com/office/word/2010/wordprocessingGroup" xmlns:wpi="http://schemas.microsoft.com/office/word/2010/wordprocessingInk" xmlns:wne="http://schemas.microsoft.com/office/word/2006/wordml" xmlns:wps="http://schemas.microsoft.com/office/word/2010/wordprocessingShape">
+  <w:p>
+    <w:pPr>
+      <w:jc w:val="center"/>
+    </w:pPr>
+    <w:r>
+      <w:rPr>
+        <w:rFonts w:ascii="Arial" w:cs="Arial" w:eastAsia="Arial" w:hAnsi="Arial"/>
+        <w:color w:val="808080"/>
+        <w:sz w:val="16"/>
+        <w:szCs w:val="16"/>
+      </w:rPr>
+      <w:t xml:space="preserve">Luyện nghe podcast YouTube – Bài 21 – trang </w:t>
+    </w:r>
+    <w:r>
+      <w:rPr>
+        <w:rFonts w:ascii="Arial" w:cs="Arial" w:eastAsia="Arial" w:hAnsi="Arial"/>
+        <w:color w:val="808080"/>
+        <w:sz w:val="16"/>
+        <w:szCs w:val="16"/>
+      </w:rPr>
+      <w:fldChar w:fldCharType="begin"/>
+      <w:instrText xml:space="preserve">PAGE</w:instrText>
+      <w:fldChar w:fldCharType="separate"/>
+      <w:fldChar w:fldCharType="end"/>
+    </w:r>
+  </w:p>
+</w:ftr>
+</file>
+
+<file path=word/footer23.xml><?xml version="1.0" encoding="utf-8"?>
+<w:ftr xmlns:wpc="http://schemas.microsoft.com/office/word/2010/wordprocessingCanvas" xmlns:mc="http://schemas.openxmlformats.org/markup-compatibility/2006" xmlns:o="urn:schemas-microsoft-com:office:office" xmlns:r="http://schemas.openxmlformats.org/officeDocument/2006/relationships" xmlns:m="http://schemas.openxmlformats.org/officeDocument/2006/math" xmlns:v="urn:schemas-microsoft-com:vml" xmlns:wp14="http://schemas.microsoft.com/office/word/2010/wordprocessingDrawing" xmlns:wp="http://schemas.openxmlformats.org/drawingml/2006/wordprocessingDrawing" xmlns:w10="urn:schemas-microsoft-com:office:word" xmlns:w="http://schemas.openxmlformats.org/wordprocessingml/2006/main" xmlns:w14="http://schemas.microsoft.com/office/word/2010/wordml" xmlns:w15="http://schemas.microsoft.com/office/word/2012/wordml" xmlns:wpg="http://schemas.microsoft.com/office/word/2010/wordprocessingGroup" xmlns:wpi="http://schemas.microsoft.com/office/word/2010/wordprocessingInk" xmlns:wne="http://schemas.microsoft.com/office/word/2006/wordml" xmlns:wps="http://schemas.microsoft.com/office/word/2010/wordprocessingShape">
+  <w:p>
+    <w:pPr>
+      <w:jc w:val="center"/>
+    </w:pPr>
+    <w:r>
+      <w:rPr>
+        <w:rFonts w:ascii="Arial" w:cs="Arial" w:eastAsia="Arial" w:hAnsi="Arial"/>
+        <w:color w:val="808080"/>
+        <w:sz w:val="16"/>
+        <w:szCs w:val="16"/>
+      </w:rPr>
+      <w:t xml:space="preserve">Luyện nghe podcast YouTube – Bài 22 – trang </w:t>
+    </w:r>
+    <w:r>
+      <w:rPr>
+        <w:rFonts w:ascii="Arial" w:cs="Arial" w:eastAsia="Arial" w:hAnsi="Arial"/>
+        <w:color w:val="808080"/>
+        <w:sz w:val="16"/>
+        <w:szCs w:val="16"/>
+      </w:rPr>
+      <w:fldChar w:fldCharType="begin"/>
+      <w:instrText xml:space="preserve">PAGE</w:instrText>
+      <w:fldChar w:fldCharType="separate"/>
+      <w:fldChar w:fldCharType="end"/>
+    </w:r>
+  </w:p>
+</w:ftr>
+</file>
+
+<file path=word/footer24.xml><?xml version="1.0" encoding="utf-8"?>
+<w:ftr xmlns:wpc="http://schemas.microsoft.com/office/word/2010/wordprocessingCanvas" xmlns:mc="http://schemas.openxmlformats.org/markup-compatibility/2006" xmlns:o="urn:schemas-microsoft-com:office:office" xmlns:r="http://schemas.openxmlformats.org/officeDocument/2006/relationships" xmlns:m="http://schemas.openxmlformats.org/officeDocument/2006/math" xmlns:v="urn:schemas-microsoft-com:vml" xmlns:wp14="http://schemas.microsoft.com/office/word/2010/wordprocessingDrawing" xmlns:wp="http://schemas.openxmlformats.org/drawingml/2006/wordprocessingDrawing" xmlns:w10="urn:schemas-microsoft-com:office:word" xmlns:w="http://schemas.openxmlformats.org/wordprocessingml/2006/main" xmlns:w14="http://schemas.microsoft.com/office/word/2010/wordml" xmlns:w15="http://schemas.microsoft.com/office/word/2012/wordml" xmlns:wpg="http://schemas.microsoft.com/office/word/2010/wordprocessingGroup" xmlns:wpi="http://schemas.microsoft.com/office/word/2010/wordprocessingInk" xmlns:wne="http://schemas.microsoft.com/office/word/2006/wordml" xmlns:wps="http://schemas.microsoft.com/office/word/2010/wordprocessingShape">
+  <w:p>
+    <w:pPr>
+      <w:jc w:val="center"/>
+    </w:pPr>
+    <w:r>
+      <w:rPr>
+        <w:rFonts w:ascii="Arial" w:cs="Arial" w:eastAsia="Arial" w:hAnsi="Arial"/>
+        <w:color w:val="808080"/>
+        <w:sz w:val="16"/>
+        <w:szCs w:val="16"/>
+      </w:rPr>
+      <w:t xml:space="preserve">Luyện nghe podcast YouTube – Bài 23 – trang </w:t>
+    </w:r>
+    <w:r>
+      <w:rPr>
+        <w:rFonts w:ascii="Arial" w:cs="Arial" w:eastAsia="Arial" w:hAnsi="Arial"/>
+        <w:color w:val="808080"/>
+        <w:sz w:val="16"/>
+        <w:szCs w:val="16"/>
+      </w:rPr>
+      <w:fldChar w:fldCharType="begin"/>
+      <w:instrText xml:space="preserve">PAGE</w:instrText>
+      <w:fldChar w:fldCharType="separate"/>
+      <w:fldChar w:fldCharType="end"/>
+    </w:r>
+  </w:p>
+</w:ftr>
+</file>
+
+<file path=word/footer25.xml><?xml version="1.0" encoding="utf-8"?>
+<w:ftr xmlns:wpc="http://schemas.microsoft.com/office/word/2010/wordprocessingCanvas" xmlns:mc="http://schemas.openxmlformats.org/markup-compatibility/2006" xmlns:o="urn:schemas-microsoft-com:office:office" xmlns:r="http://schemas.openxmlformats.org/officeDocument/2006/relationships" xmlns:m="http://schemas.openxmlformats.org/officeDocument/2006/math" xmlns:v="urn:schemas-microsoft-com:vml" xmlns:wp14="http://schemas.microsoft.com/office/word/2010/wordprocessingDrawing" xmlns:wp="http://schemas.openxmlformats.org/drawingml/2006/wordprocessingDrawing" xmlns:w10="urn:schemas-microsoft-com:office:word" xmlns:w="http://schemas.openxmlformats.org/wordprocessingml/2006/main" xmlns:w14="http://schemas.microsoft.com/office/word/2010/wordml" xmlns:w15="http://schemas.microsoft.com/office/word/2012/wordml" xmlns:wpg="http://schemas.microsoft.com/office/word/2010/wordprocessingGroup" xmlns:wpi="http://schemas.microsoft.com/office/word/2010/wordprocessingInk" xmlns:wne="http://schemas.microsoft.com/office/word/2006/wordml" xmlns:wps="http://schemas.microsoft.com/office/word/2010/wordprocessingShape">
+  <w:p>
+    <w:pPr>
+      <w:jc w:val="center"/>
+    </w:pPr>
+    <w:r>
+      <w:rPr>
+        <w:rFonts w:ascii="Arial" w:cs="Arial" w:eastAsia="Arial" w:hAnsi="Arial"/>
+        <w:color w:val="808080"/>
+        <w:sz w:val="16"/>
+        <w:szCs w:val="16"/>
+      </w:rPr>
+      <w:t xml:space="preserve">Luyện nghe podcast YouTube – Bài 24 – trang </w:t>
+    </w:r>
+    <w:r>
+      <w:rPr>
+        <w:rFonts w:ascii="Arial" w:cs="Arial" w:eastAsia="Arial" w:hAnsi="Arial"/>
+        <w:color w:val="808080"/>
+        <w:sz w:val="16"/>
+        <w:szCs w:val="16"/>
+      </w:rPr>
+      <w:fldChar w:fldCharType="begin"/>
+      <w:instrText xml:space="preserve">PAGE</w:instrText>
+      <w:fldChar w:fldCharType="separate"/>
+      <w:fldChar w:fldCharType="end"/>
+    </w:r>
+  </w:p>
+</w:ftr>
+</file>
+
+<file path=word/footer3.xml><?xml version="1.0" encoding="utf-8"?>
+<w:ftr xmlns:wpc="http://schemas.microsoft.com/office/word/2010/wordprocessingCanvas" xmlns:mc="http://schemas.openxmlformats.org/markup-compatibility/2006" xmlns:o="urn:schemas-microsoft-com:office:office" xmlns:r="http://schemas.openxmlformats.org/officeDocument/2006/relationships" xmlns:m="http://schemas.openxmlformats.org/officeDocument/2006/math" xmlns:v="urn:schemas-microsoft-com:vml" xmlns:wp14="http://schemas.microsoft.com/office/word/2010/wordprocessingDrawing" xmlns:wp="http://schemas.openxmlformats.org/drawingml/2006/wordprocessingDrawing" xmlns:w10="urn:schemas-microsoft-com:office:word" xmlns:w="http://schemas.openxmlformats.org/wordprocessingml/2006/main" xmlns:w14="http://schemas.microsoft.com/office/word/2010/wordml" xmlns:w15="http://schemas.microsoft.com/office/word/2012/wordml" xmlns:wpg="http://schemas.microsoft.com/office/word/2010/wordprocessingGroup" xmlns:wpi="http://schemas.microsoft.com/office/word/2010/wordprocessingInk" xmlns:wne="http://schemas.microsoft.com/office/word/2006/wordml" xmlns:wps="http://schemas.microsoft.com/office/word/2010/wordprocessingShape">
+  <w:p>
+    <w:pPr>
+      <w:jc w:val="center"/>
+    </w:pPr>
+    <w:r>
+      <w:rPr>
+        <w:rFonts w:ascii="Arial" w:cs="Arial" w:eastAsia="Arial" w:hAnsi="Arial"/>
+        <w:color w:val="808080"/>
+        <w:sz w:val="16"/>
+        <w:szCs w:val="16"/>
+      </w:rPr>
+      <w:t xml:space="preserve">Luyện nghe podcast YouTube – Bài 2 – trang </w:t>
+    </w:r>
+    <w:r>
+      <w:rPr>
+        <w:rFonts w:ascii="Arial" w:cs="Arial" w:eastAsia="Arial" w:hAnsi="Arial"/>
+        <w:color w:val="808080"/>
+        <w:sz w:val="16"/>
+        <w:szCs w:val="16"/>
+      </w:rPr>
+      <w:fldChar w:fldCharType="begin"/>
+      <w:instrText xml:space="preserve">PAGE</w:instrText>
+      <w:fldChar w:fldCharType="separate"/>
+      <w:fldChar w:fldCharType="end"/>
+    </w:r>
+  </w:p>
+</w:ftr>
+</file>
+
+<file path=word/footer4.xml><?xml version="1.0" encoding="utf-8"?>
+<w:ftr xmlns:wpc="http://schemas.microsoft.com/office/word/2010/wordprocessingCanvas" xmlns:mc="http://schemas.openxmlformats.org/markup-compatibility/2006" xmlns:o="urn:schemas-microsoft-com:office:office" xmlns:r="http://schemas.openxmlformats.org/officeDocument/2006/relationships" xmlns:m="http://schemas.openxmlformats.org/officeDocument/2006/math" xmlns:v="urn:schemas-microsoft-com:vml" xmlns:wp14="http://schemas.microsoft.com/office/word/2010/wordprocessingDrawing" xmlns:wp="http://schemas.openxmlformats.org/drawingml/2006/wordprocessingDrawing" xmlns:w10="urn:schemas-microsoft-com:office:word" xmlns:w="http://schemas.openxmlformats.org/wordprocessingml/2006/main" xmlns:w14="http://schemas.microsoft.com/office/word/2010/wordml" xmlns:w15="http://schemas.microsoft.com/office/word/2012/wordml" xmlns:wpg="http://schemas.microsoft.com/office/word/2010/wordprocessingGroup" xmlns:wpi="http://schemas.microsoft.com/office/word/2010/wordprocessingInk" xmlns:wne="http://schemas.microsoft.com/office/word/2006/wordml" xmlns:wps="http://schemas.microsoft.com/office/word/2010/wordprocessingShape">
+  <w:p>
+    <w:pPr>
+      <w:jc w:val="center"/>
+    </w:pPr>
+    <w:r>
+      <w:rPr>
+        <w:rFonts w:ascii="Arial" w:cs="Arial" w:eastAsia="Arial" w:hAnsi="Arial"/>
+        <w:color w:val="808080"/>
+        <w:sz w:val="16"/>
+        <w:szCs w:val="16"/>
+      </w:rPr>
+      <w:t xml:space="preserve">Luyện nghe podcast YouTube – Bài 3 – trang </w:t>
+    </w:r>
+    <w:r>
+      <w:rPr>
+        <w:rFonts w:ascii="Arial" w:cs="Arial" w:eastAsia="Arial" w:hAnsi="Arial"/>
+        <w:color w:val="808080"/>
+        <w:sz w:val="16"/>
+        <w:szCs w:val="16"/>
+      </w:rPr>
+      <w:fldChar w:fldCharType="begin"/>
+      <w:instrText xml:space="preserve">PAGE</w:instrText>
+      <w:fldChar w:fldCharType="separate"/>
+      <w:fldChar w:fldCharType="end"/>
+    </w:r>
+  </w:p>
+</w:ftr>
+</file>
+
+<file path=word/footer5.xml><?xml version="1.0" encoding="utf-8"?>
+<w:ftr xmlns:wpc="http://schemas.microsoft.com/office/word/2010/wordprocessingCanvas" xmlns:mc="http://schemas.openxmlformats.org/markup-compatibility/2006" xmlns:o="urn:schemas-microsoft-com:office:office" xmlns:r="http://schemas.openxmlformats.org/officeDocument/2006/relationships" xmlns:m="http://schemas.openxmlformats.org/officeDocument/2006/math" xmlns:v="urn:schemas-microsoft-com:vml" xmlns:wp14="http://schemas.microsoft.com/office/word/2010/wordprocessingDrawing" xmlns:wp="http://schemas.openxmlformats.org/drawingml/2006/wordprocessingDrawing" xmlns:w10="urn:schemas-microsoft-com:office:word" xmlns:w="http://schemas.openxmlformats.org/wordprocessingml/2006/main" xmlns:w14="http://schemas.microsoft.com/office/word/2010/wordml" xmlns:w15="http://schemas.microsoft.com/office/word/2012/wordml" xmlns:wpg="http://schemas.microsoft.com/office/word/2010/wordprocessingGroup" xmlns:wpi="http://schemas.microsoft.com/office/word/2010/wordprocessingInk" xmlns:wne="http://schemas.microsoft.com/office/word/2006/wordml" xmlns:wps="http://schemas.microsoft.com/office/word/2010/wordprocessingShape">
+  <w:p>
+    <w:pPr>
+      <w:jc w:val="center"/>
+    </w:pPr>
+    <w:r>
+      <w:rPr>
+        <w:rFonts w:ascii="Arial" w:cs="Arial" w:eastAsia="Arial" w:hAnsi="Arial"/>
+        <w:color w:val="808080"/>
+        <w:sz w:val="16"/>
+        <w:szCs w:val="16"/>
+      </w:rPr>
+      <w:t xml:space="preserve">Luyện nghe podcast YouTube – Bài 4 – trang </w:t>
+    </w:r>
+    <w:r>
+      <w:rPr>
+        <w:rFonts w:ascii="Arial" w:cs="Arial" w:eastAsia="Arial" w:hAnsi="Arial"/>
+        <w:color w:val="808080"/>
+        <w:sz w:val="16"/>
+        <w:szCs w:val="16"/>
+      </w:rPr>
+      <w:fldChar w:fldCharType="begin"/>
+      <w:instrText xml:space="preserve">PAGE</w:instrText>
+      <w:fldChar w:fldCharType="separate"/>
+      <w:fldChar w:fldCharType="end"/>
+    </w:r>
+  </w:p>
+</w:ftr>
+</file>
+
+<file path=word/footer6.xml><?xml version="1.0" encoding="utf-8"?>
+<w:ftr xmlns:wpc="http://schemas.microsoft.com/office/word/2010/wordprocessingCanvas" xmlns:mc="http://schemas.openxmlformats.org/markup-compatibility/2006" xmlns:o="urn:schemas-microsoft-com:office:office" xmlns:r="http://schemas.openxmlformats.org/officeDocument/2006/relationships" xmlns:m="http://schemas.openxmlformats.org/officeDocument/2006/math" xmlns:v="urn:schemas-microsoft-com:vml" xmlns:wp14="http://schemas.microsoft.com/office/word/2010/wordprocessingDrawing" xmlns:wp="http://schemas.openxmlformats.org/drawingml/2006/wordprocessingDrawing" xmlns:w10="urn:schemas-microsoft-com:office:word" xmlns:w="http://schemas.openxmlformats.org/wordprocessingml/2006/main" xmlns:w14="http://schemas.microsoft.com/office/word/2010/wordml" xmlns:w15="http://schemas.microsoft.com/office/word/2012/wordml" xmlns:wpg="http://schemas.microsoft.com/office/word/2010/wordprocessingGroup" xmlns:wpi="http://schemas.microsoft.com/office/word/2010/wordprocessingInk" xmlns:wne="http://schemas.microsoft.com/office/word/2006/wordml" xmlns:wps="http://schemas.microsoft.com/office/word/2010/wordprocessingShape">
+  <w:p>
+    <w:pPr>
+      <w:jc w:val="center"/>
+    </w:pPr>
+    <w:r>
+      <w:rPr>
+        <w:rFonts w:ascii="Arial" w:cs="Arial" w:eastAsia="Arial" w:hAnsi="Arial"/>
+        <w:color w:val="808080"/>
+        <w:sz w:val="16"/>
+        <w:szCs w:val="16"/>
+      </w:rPr>
+      <w:t xml:space="preserve">Luyện nghe podcast YouTube – Bài 5 – trang </w:t>
+    </w:r>
+    <w:r>
+      <w:rPr>
+        <w:rFonts w:ascii="Arial" w:cs="Arial" w:eastAsia="Arial" w:hAnsi="Arial"/>
+        <w:color w:val="808080"/>
+        <w:sz w:val="16"/>
+        <w:szCs w:val="16"/>
+      </w:rPr>
+      <w:fldChar w:fldCharType="begin"/>
+      <w:instrText xml:space="preserve">PAGE</w:instrText>
+      <w:fldChar w:fldCharType="separate"/>
+      <w:fldChar w:fldCharType="end"/>
+    </w:r>
+  </w:p>
+</w:ftr>
+</file>
+
+<file path=word/footer7.xml><?xml version="1.0" encoding="utf-8"?>
+<w:ftr xmlns:wpc="http://schemas.microsoft.com/office/word/2010/wordprocessingCanvas" xmlns:mc="http://schemas.openxmlformats.org/markup-compatibility/2006" xmlns:o="urn:schemas-microsoft-com:office:office" xmlns:r="http://schemas.openxmlformats.org/officeDocument/2006/relationships" xmlns:m="http://schemas.openxmlformats.org/officeDocument/2006/math" xmlns:v="urn:schemas-microsoft-com:vml" xmlns:wp14="http://schemas.microsoft.com/office/word/2010/wordprocessingDrawing" xmlns:wp="http://schemas.openxmlformats.org/drawingml/2006/wordprocessingDrawing" xmlns:w10="urn:schemas-microsoft-com:office:word" xmlns:w="http://schemas.openxmlformats.org/wordprocessingml/2006/main" xmlns:w14="http://schemas.microsoft.com/office/word/2010/wordml" xmlns:w15="http://schemas.microsoft.com/office/word/2012/wordml" xmlns:wpg="http://schemas.microsoft.com/office/word/2010/wordprocessingGroup" xmlns:wpi="http://schemas.microsoft.com/office/word/2010/wordprocessingInk" xmlns:wne="http://schemas.microsoft.com/office/word/2006/wordml" xmlns:wps="http://schemas.microsoft.com/office/word/2010/wordprocessingShape">
+  <w:p>
+    <w:pPr>
+      <w:jc w:val="center"/>
+    </w:pPr>
+    <w:r>
+      <w:rPr>
+        <w:rFonts w:ascii="Arial" w:cs="Arial" w:eastAsia="Arial" w:hAnsi="Arial"/>
+        <w:color w:val="808080"/>
+        <w:sz w:val="16"/>
+        <w:szCs w:val="16"/>
+      </w:rPr>
+      <w:t xml:space="preserve">Luyện nghe podcast YouTube – Bài 6 – trang </w:t>
+    </w:r>
+    <w:r>
+      <w:rPr>
+        <w:rFonts w:ascii="Arial" w:cs="Arial" w:eastAsia="Arial" w:hAnsi="Arial"/>
+        <w:color w:val="808080"/>
+        <w:sz w:val="16"/>
+        <w:szCs w:val="16"/>
+      </w:rPr>
+      <w:fldChar w:fldCharType="begin"/>
+      <w:instrText xml:space="preserve">PAGE</w:instrText>
+      <w:fldChar w:fldCharType="separate"/>
+      <w:fldChar w:fldCharType="end"/>
+    </w:r>
+  </w:p>
+</w:ftr>
+</file>
+
+<file path=word/footer8.xml><?xml version="1.0" encoding="utf-8"?>
+<w:ftr xmlns:wpc="http://schemas.microsoft.com/office/word/2010/wordprocessingCanvas" xmlns:mc="http://schemas.openxmlformats.org/markup-compatibility/2006" xmlns:o="urn:schemas-microsoft-com:office:office" xmlns:r="http://schemas.openxmlformats.org/officeDocument/2006/relationships" xmlns:m="http://schemas.openxmlformats.org/officeDocument/2006/math" xmlns:v="urn:schemas-microsoft-com:vml" xmlns:wp14="http://schemas.microsoft.com/office/word/2010/wordprocessingDrawing" xmlns:wp="http://schemas.openxmlformats.org/drawingml/2006/wordprocessingDrawing" xmlns:w10="urn:schemas-microsoft-com:office:word" xmlns:w="http://schemas.openxmlformats.org/wordprocessingml/2006/main" xmlns:w14="http://schemas.microsoft.com/office/word/2010/wordml" xmlns:w15="http://schemas.microsoft.com/office/word/2012/wordml" xmlns:wpg="http://schemas.microsoft.com/office/word/2010/wordprocessingGroup" xmlns:wpi="http://schemas.microsoft.com/office/word/2010/wordprocessingInk" xmlns:wne="http://schemas.microsoft.com/office/word/2006/wordml" xmlns:wps="http://schemas.microsoft.com/office/word/2010/wordprocessingShape">
+  <w:p>
+    <w:pPr>
+      <w:jc w:val="center"/>
+    </w:pPr>
+    <w:r>
+      <w:rPr>
+        <w:rFonts w:ascii="Arial" w:cs="Arial" w:eastAsia="Arial" w:hAnsi="Arial"/>
+        <w:color w:val="808080"/>
+        <w:sz w:val="16"/>
+        <w:szCs w:val="16"/>
+      </w:rPr>
+      <w:t xml:space="preserve">Luyện nghe podcast YouTube – Bài 7 – trang </w:t>
+    </w:r>
+    <w:r>
+      <w:rPr>
+        <w:rFonts w:ascii="Arial" w:cs="Arial" w:eastAsia="Arial" w:hAnsi="Arial"/>
+        <w:color w:val="808080"/>
+        <w:sz w:val="16"/>
+        <w:szCs w:val="16"/>
+      </w:rPr>
+      <w:fldChar w:fldCharType="begin"/>
+      <w:instrText xml:space="preserve">PAGE</w:instrText>
+      <w:fldChar w:fldCharType="separate"/>
+      <w:fldChar w:fldCharType="end"/>
+    </w:r>
+  </w:p>
+</w:ftr>
+</file>
+
+<file path=word/footer9.xml><?xml version="1.0" encoding="utf-8"?>
+<w:ftr xmlns:wpc="http://schemas.microsoft.com/office/word/2010/wordprocessingCanvas" xmlns:mc="http://schemas.openxmlformats.org/markup-compatibility/2006" xmlns:o="urn:schemas-microsoft-com:office:office" xmlns:r="http://schemas.openxmlformats.org/officeDocument/2006/relationships" xmlns:m="http://schemas.openxmlformats.org/officeDocument/2006/math" xmlns:v="urn:schemas-microsoft-com:vml" xmlns:wp14="http://schemas.microsoft.com/office/word/2010/wordprocessingDrawing" xmlns:wp="http://schemas.openxmlformats.org/drawingml/2006/wordprocessingDrawing" xmlns:w10="urn:schemas-microsoft-com:office:word" xmlns:w="http://schemas.openxmlformats.org/wordprocessingml/2006/main" xmlns:w14="http://schemas.microsoft.com/office/word/2010/wordml" xmlns:w15="http://schemas.microsoft.com/office/word/2012/wordml" xmlns:wpg="http://schemas.microsoft.com/office/word/2010/wordprocessingGroup" xmlns:wpi="http://schemas.microsoft.com/office/word/2010/wordprocessingInk" xmlns:wne="http://schemas.microsoft.com/office/word/2006/wordml" xmlns:wps="http://schemas.microsoft.com/office/word/2010/wordprocessingShape">
+  <w:p>
+    <w:pPr>
+      <w:jc w:val="center"/>
+    </w:pPr>
+    <w:r>
+      <w:rPr>
+        <w:rFonts w:ascii="Arial" w:cs="Arial" w:eastAsia="Arial" w:hAnsi="Arial"/>
+        <w:color w:val="808080"/>
+        <w:sz w:val="16"/>
+        <w:szCs w:val="16"/>
+      </w:rPr>
+      <w:t xml:space="preserve">Luyện nghe podcast YouTube – Bài 8 – trang </w:t>
     </w:r>
     <w:r>
       <w:rPr>

</xml_diff>